<commit_message>
feat: publish AI-first infographic courseware v12
</commit_message>
<xml_diff>
--- a/courseware/LG-Infographics and Data Visualization with PowerPoint.docx
+++ b/courseware/LG-Infographics and Data Visualization with PowerPoint.docx
@@ -123,7 +123,7 @@
           <w:color w:val="111827"/>
           <w:sz w:val="24"/>
         </w:rPr>
-        <w:t>TGS Ref No: TGS-2024048310</w:t>
+        <w:t>TGS Ref No: TGS-2026064178</w:t>
       </w:r>
     </w:p>
     <w:p>
@@ -179,7 +179,7 @@
           <w:color w:val="1F6FEB"/>
           <w:sz w:val="24"/>
         </w:rPr>
-        <w:t>Version 3.0</w:t>
+        <w:t>Version 4.0</w:t>
       </w:r>
     </w:p>
     <w:p>
@@ -380,7 +380,65 @@
               <w:rPr>
                 <w:sz w:val="19"/>
               </w:rPr>
-              <w:t>Rebuilt from the approved v10 deck with retained legacy coverage, current Microsoft infographic-maker and AI Designer guidance, eight progressive activities, detailed click-by-click PowerPoint procedures, editable mock CSV/Excel/PPT evidence, peer review and tool-investment controls.</w:t>
+              <w:t>Rebuilt from the approved v10 deck with current Microsoft infographic-maker and Copilot guidance, eight progressive activities, detailed PowerPoint procedures and editable evidence packs.</w:t>
+            </w:r>
+          </w:p>
+        </w:tc>
+        <w:tc>
+          <w:tcPr>
+            <w:tcW w:type="dxa" w:w="2160"/>
+          </w:tcPr>
+          <w:p>
+            <w:r/>
+            <w:r>
+              <w:rPr>
+                <w:sz w:val="19"/>
+              </w:rPr>
+              <w:t>Tertiary Infotech Academy Pte Ltd</w:t>
+            </w:r>
+          </w:p>
+        </w:tc>
+      </w:tr>
+      <w:tr>
+        <w:tc>
+          <w:tcPr>
+            <w:tcW w:type="dxa" w:w="2160"/>
+          </w:tcPr>
+          <w:p>
+            <w:r/>
+            <w:r>
+              <w:rPr>
+                <w:sz w:val="19"/>
+              </w:rPr>
+              <w:t>4.0</w:t>
+            </w:r>
+          </w:p>
+        </w:tc>
+        <w:tc>
+          <w:tcPr>
+            <w:tcW w:type="dxa" w:w="2160"/>
+          </w:tcPr>
+          <w:p>
+            <w:r/>
+            <w:r>
+              <w:rPr>
+                <w:sz w:val="19"/>
+              </w:rPr>
+              <w:t>16 August 2026</w:t>
+            </w:r>
+          </w:p>
+        </w:tc>
+        <w:tc>
+          <w:tcPr>
+            <w:tcW w:type="dxa" w:w="2160"/>
+          </w:tcPr>
+          <w:p>
+            <w:r/>
+            <w:r>
+              <w:rPr>
+                <w:sz w:val="19"/>
+              </w:rPr>
+              <w:t>Added the AI-first data-to-insight-to-infographic workflow, Microsoft 365 Copilot and Gemini Notebook procedures, PowerPoint conversion and comparison, prompt patterns, mock multi-source data, generated practice assets and verification controls. Migrated the package to current course code TGS-2026064178.</w:t>
             </w:r>
           </w:p>
         </w:tc>
@@ -406,375 +464,463 @@
       </w:r>
     </w:p>
     <w:p>
+      <w:pPr>
+        <w:spacing w:after="120"/>
+      </w:pPr>
       <w:r>
         <w:rPr>
           <w:b/>
+          <w:color w:val="111827"/>
           <w:sz w:val="24"/>
         </w:rPr>
         <w:t>TABLE OF CONTENTS</w:t>
       </w:r>
     </w:p>
-    <w:tbl>
-      <w:tblPr>
-        <w:tblStyle w:val="TableGrid"/>
-        <w:tblW w:type="auto" w:w="0"/>
-        <w:tblLook w:firstColumn="1" w:firstRow="1" w:lastColumn="0" w:lastRow="0" w:noHBand="0" w:noVBand="1" w:val="04A0"/>
-      </w:tblPr>
-      <w:tblGrid>
-        <w:gridCol w:w="4320"/>
-        <w:gridCol w:w="4320"/>
-      </w:tblGrid>
-      <w:tr>
-        <w:tc>
-          <w:tcPr>
-            <w:tcW w:type="dxa" w:w="4320"/>
-          </w:tcPr>
-          <w:p>
-            <w:r>
-              <w:t>How to Use This Guide</w:t>
-            </w:r>
-          </w:p>
-        </w:tc>
-        <w:tc>
-          <w:tcPr>
-            <w:tcW w:type="dxa" w:w="4320"/>
-          </w:tcPr>
-          <w:p>
-            <w:pPr>
-              <w:jc w:val="right"/>
-            </w:pPr>
-            <w:r>
-              <w:t>4</w:t>
-            </w:r>
-          </w:p>
-        </w:tc>
-      </w:tr>
-      <w:tr>
-        <w:tc>
-          <w:tcPr>
-            <w:tcW w:type="dxa" w:w="4320"/>
-          </w:tcPr>
-          <w:p>
-            <w:r>
-              <w:t>Infographic Foundations</w:t>
-            </w:r>
-          </w:p>
-        </w:tc>
-        <w:tc>
-          <w:tcPr>
-            <w:tcW w:type="dxa" w:w="4320"/>
-          </w:tcPr>
-          <w:p>
-            <w:pPr>
-              <w:jc w:val="right"/>
-            </w:pPr>
-            <w:r>
-              <w:t>4</w:t>
-            </w:r>
-          </w:p>
-        </w:tc>
-      </w:tr>
-      <w:tr>
-        <w:tc>
-          <w:tcPr>
-            <w:tcW w:type="dxa" w:w="4320"/>
-          </w:tcPr>
-          <w:p>
-            <w:r>
-              <w:t>Planning an Infographic</w:t>
-            </w:r>
-          </w:p>
-        </w:tc>
-        <w:tc>
-          <w:tcPr>
-            <w:tcW w:type="dxa" w:w="4320"/>
-          </w:tcPr>
-          <w:p>
-            <w:pPr>
-              <w:jc w:val="right"/>
-            </w:pPr>
-            <w:r>
-              <w:t>5</w:t>
-            </w:r>
-          </w:p>
-        </w:tc>
-      </w:tr>
-      <w:tr>
-        <w:tc>
-          <w:tcPr>
-            <w:tcW w:type="dxa" w:w="4320"/>
-          </w:tcPr>
-          <w:p>
-            <w:r>
-              <w:t>PowerPoint Design System</w:t>
-            </w:r>
-          </w:p>
-        </w:tc>
-        <w:tc>
-          <w:tcPr>
-            <w:tcW w:type="dxa" w:w="4320"/>
-          </w:tcPr>
-          <w:p>
-            <w:pPr>
-              <w:jc w:val="right"/>
-            </w:pPr>
-            <w:r>
-              <w:t>5</w:t>
-            </w:r>
-          </w:p>
-        </w:tc>
-      </w:tr>
-      <w:tr>
-        <w:tc>
-          <w:tcPr>
-            <w:tcW w:type="dxa" w:w="4320"/>
-          </w:tcPr>
-          <w:p>
-            <w:r>
-              <w:t>Microsoft Infographic Maker and AI Designer</w:t>
-            </w:r>
-          </w:p>
-        </w:tc>
-        <w:tc>
-          <w:tcPr>
-            <w:tcW w:type="dxa" w:w="4320"/>
-          </w:tcPr>
-          <w:p>
-            <w:pPr>
-              <w:jc w:val="right"/>
-            </w:pPr>
-            <w:r>
-              <w:t>5</w:t>
-            </w:r>
-          </w:p>
-        </w:tc>
-      </w:tr>
-      <w:tr>
-        <w:tc>
-          <w:tcPr>
-            <w:tcW w:type="dxa" w:w="4320"/>
-          </w:tcPr>
-          <w:p>
-            <w:r>
-              <w:t>Review and Resource Decisions</w:t>
-            </w:r>
-          </w:p>
-        </w:tc>
-        <w:tc>
-          <w:tcPr>
-            <w:tcW w:type="dxa" w:w="4320"/>
-          </w:tcPr>
-          <w:p>
-            <w:pPr>
-              <w:jc w:val="right"/>
-            </w:pPr>
-            <w:r>
-              <w:t>6</w:t>
-            </w:r>
-          </w:p>
-        </w:tc>
-      </w:tr>
-      <w:tr>
-        <w:tc>
-          <w:tcPr>
-            <w:tcW w:type="dxa" w:w="4320"/>
-          </w:tcPr>
-          <w:p>
-            <w:r>
-              <w:t>LU1 — Introduction to Infographics</w:t>
-            </w:r>
-          </w:p>
-        </w:tc>
-        <w:tc>
-          <w:tcPr>
-            <w:tcW w:type="dxa" w:w="4320"/>
-          </w:tcPr>
-          <w:p>
-            <w:pPr>
-              <w:jc w:val="right"/>
-            </w:pPr>
-            <w:r>
-              <w:t>6</w:t>
-            </w:r>
-          </w:p>
-        </w:tc>
-      </w:tr>
-      <w:tr>
-        <w:tc>
-          <w:tcPr>
-            <w:tcW w:type="dxa" w:w="4320"/>
-          </w:tcPr>
-          <w:p>
-            <w:r>
-              <w:t>Activities 1–2</w:t>
-            </w:r>
-          </w:p>
-        </w:tc>
-        <w:tc>
-          <w:tcPr>
-            <w:tcW w:type="dxa" w:w="4320"/>
-          </w:tcPr>
-          <w:p>
-            <w:pPr>
-              <w:jc w:val="right"/>
-            </w:pPr>
-            <w:r>
-              <w:t>7</w:t>
-            </w:r>
-          </w:p>
-        </w:tc>
-      </w:tr>
-      <w:tr>
-        <w:tc>
-          <w:tcPr>
-            <w:tcW w:type="dxa" w:w="4320"/>
-          </w:tcPr>
-          <w:p>
-            <w:r>
-              <w:t>LU2 — Create Infographics in PowerPoint</w:t>
-            </w:r>
-          </w:p>
-        </w:tc>
-        <w:tc>
-          <w:tcPr>
-            <w:tcW w:type="dxa" w:w="4320"/>
-          </w:tcPr>
-          <w:p>
-            <w:pPr>
-              <w:jc w:val="right"/>
-            </w:pPr>
-            <w:r>
-              <w:t>10</w:t>
-            </w:r>
-          </w:p>
-        </w:tc>
-      </w:tr>
-      <w:tr>
-        <w:tc>
-          <w:tcPr>
-            <w:tcW w:type="dxa" w:w="4320"/>
-          </w:tcPr>
-          <w:p>
-            <w:r>
-              <w:t>Activities 3–6</w:t>
-            </w:r>
-          </w:p>
-        </w:tc>
-        <w:tc>
-          <w:tcPr>
-            <w:tcW w:type="dxa" w:w="4320"/>
-          </w:tcPr>
-          <w:p>
-            <w:pPr>
-              <w:jc w:val="right"/>
-            </w:pPr>
-            <w:r>
-              <w:t>10</w:t>
-            </w:r>
-          </w:p>
-        </w:tc>
-      </w:tr>
-      <w:tr>
-        <w:tc>
-          <w:tcPr>
-            <w:tcW w:type="dxa" w:w="4320"/>
-          </w:tcPr>
-          <w:p>
-            <w:r>
-              <w:t>LU3 — Review Infographics</w:t>
-            </w:r>
-          </w:p>
-        </w:tc>
-        <w:tc>
-          <w:tcPr>
-            <w:tcW w:type="dxa" w:w="4320"/>
-          </w:tcPr>
-          <w:p>
-            <w:pPr>
-              <w:jc w:val="right"/>
-            </w:pPr>
-            <w:r>
-              <w:t>16</w:t>
-            </w:r>
-          </w:p>
-        </w:tc>
-      </w:tr>
-      <w:tr>
-        <w:tc>
-          <w:tcPr>
-            <w:tcW w:type="dxa" w:w="4320"/>
-          </w:tcPr>
-          <w:p>
-            <w:r>
-              <w:t>Activities 7–8</w:t>
-            </w:r>
-          </w:p>
-        </w:tc>
-        <w:tc>
-          <w:tcPr>
-            <w:tcW w:type="dxa" w:w="4320"/>
-          </w:tcPr>
-          <w:p>
-            <w:pPr>
-              <w:jc w:val="right"/>
-            </w:pPr>
-            <w:r>
-              <w:t>17</w:t>
-            </w:r>
-          </w:p>
-        </w:tc>
-      </w:tr>
-      <w:tr>
-        <w:tc>
-          <w:tcPr>
-            <w:tcW w:type="dxa" w:w="4320"/>
-          </w:tcPr>
-          <w:p>
-            <w:r>
-              <w:t>Quick PowerPoint Reference and Assessment</w:t>
-            </w:r>
-          </w:p>
-        </w:tc>
-        <w:tc>
-          <w:tcPr>
-            <w:tcW w:type="dxa" w:w="4320"/>
-          </w:tcPr>
-          <w:p>
-            <w:pPr>
-              <w:jc w:val="right"/>
-            </w:pPr>
-            <w:r>
-              <w:t>20</w:t>
-            </w:r>
-          </w:p>
-        </w:tc>
-      </w:tr>
-      <w:tr>
-        <w:tc>
-          <w:tcPr>
-            <w:tcW w:type="dxa" w:w="4320"/>
-          </w:tcPr>
-          <w:p>
-            <w:r>
-              <w:t>Sources, Support and Further Reading</w:t>
-            </w:r>
-          </w:p>
-        </w:tc>
-        <w:tc>
-          <w:tcPr>
-            <w:tcW w:type="dxa" w:w="4320"/>
-          </w:tcPr>
-          <w:p>
-            <w:pPr>
-              <w:jc w:val="right"/>
-            </w:pPr>
-            <w:r>
-              <w:t>21</w:t>
-            </w:r>
-          </w:p>
-        </w:tc>
-      </w:tr>
-    </w:tbl>
+    <w:p>
+      <w:pPr>
+        <w:tabs>
+          <w:tab w:pos="9072" w:val="right" w:leader="dot"/>
+        </w:tabs>
+        <w:spacing w:after="60"/>
+      </w:pPr>
+      <w:r>
+        <w:rPr>
+          <w:rFonts w:ascii="Arial" w:hAnsi="Arial"/>
+          <w:b/>
+          <w:color w:val="333333"/>
+          <w:sz w:val="22"/>
+        </w:rPr>
+        <w:t>How to Use This Guide</w:t>
+        <w:tab/>
+        <w:t>4</w:t>
+      </w:r>
+    </w:p>
+    <w:p>
+      <w:pPr>
+        <w:tabs>
+          <w:tab w:pos="9072" w:val="right" w:leader="dot"/>
+        </w:tabs>
+        <w:spacing w:after="60"/>
+      </w:pPr>
+      <w:r>
+        <w:rPr>
+          <w:rFonts w:ascii="Arial" w:hAnsi="Arial"/>
+          <w:b/>
+          <w:color w:val="333333"/>
+          <w:sz w:val="22"/>
+        </w:rPr>
+        <w:t>Learning Outcomes</w:t>
+        <w:tab/>
+        <w:t>4</w:t>
+      </w:r>
+    </w:p>
+    <w:p>
+      <w:pPr>
+        <w:tabs>
+          <w:tab w:pos="9072" w:val="right" w:leader="dot"/>
+        </w:tabs>
+        <w:spacing w:after="60"/>
+      </w:pPr>
+      <w:r>
+        <w:rPr>
+          <w:rFonts w:ascii="Arial" w:hAnsi="Arial"/>
+          <w:b/>
+          <w:color w:val="333333"/>
+          <w:sz w:val="22"/>
+        </w:rPr>
+        <w:t>Infographic Foundations</w:t>
+        <w:tab/>
+        <w:t>4</w:t>
+      </w:r>
+    </w:p>
+    <w:p>
+      <w:pPr>
+        <w:tabs>
+          <w:tab w:pos="9072" w:val="right" w:leader="dot"/>
+        </w:tabs>
+        <w:spacing w:after="60"/>
+      </w:pPr>
+      <w:r>
+        <w:rPr>
+          <w:rFonts w:ascii="Arial" w:hAnsi="Arial"/>
+          <w:b/>
+          <w:color w:val="333333"/>
+          <w:sz w:val="22"/>
+        </w:rPr>
+        <w:t>AI-First Data-to-Infographic Workflow</w:t>
+        <w:tab/>
+        <w:t>5</w:t>
+      </w:r>
+    </w:p>
+    <w:p>
+      <w:pPr>
+        <w:tabs>
+          <w:tab w:pos="9072" w:val="right" w:leader="dot"/>
+        </w:tabs>
+        <w:spacing w:after="60"/>
+      </w:pPr>
+      <w:r>
+        <w:rPr>
+          <w:rFonts w:ascii="Arial" w:hAnsi="Arial"/>
+          <w:b/>
+          <w:color w:val="333333"/>
+          <w:sz w:val="22"/>
+        </w:rPr>
+        <w:t>PowerPoint Design System</w:t>
+        <w:tab/>
+        <w:t>6</w:t>
+      </w:r>
+    </w:p>
+    <w:p>
+      <w:pPr>
+        <w:tabs>
+          <w:tab w:pos="9072" w:val="right" w:leader="dot"/>
+        </w:tabs>
+        <w:spacing w:after="60"/>
+      </w:pPr>
+      <w:r>
+        <w:rPr>
+          <w:rFonts w:ascii="Arial" w:hAnsi="Arial"/>
+          <w:b/>
+          <w:color w:val="333333"/>
+          <w:sz w:val="22"/>
+        </w:rPr>
+        <w:t>Microsoft 365 Copilot and Gemini Notebook</w:t>
+        <w:tab/>
+        <w:t>7</w:t>
+      </w:r>
+    </w:p>
+    <w:p>
+      <w:pPr>
+        <w:tabs>
+          <w:tab w:pos="9072" w:val="right" w:leader="dot"/>
+        </w:tabs>
+        <w:spacing w:after="60"/>
+      </w:pPr>
+      <w:r>
+        <w:rPr>
+          <w:rFonts w:ascii="Arial" w:hAnsi="Arial"/>
+          <w:b/>
+          <w:color w:val="333333"/>
+          <w:sz w:val="22"/>
+        </w:rPr>
+        <w:t>Review and Resource Decisions</w:t>
+        <w:tab/>
+        <w:t>8</w:t>
+      </w:r>
+    </w:p>
+    <w:p>
+      <w:pPr>
+        <w:tabs>
+          <w:tab w:pos="9072" w:val="right" w:leader="dot"/>
+        </w:tabs>
+        <w:spacing w:after="60"/>
+      </w:pPr>
+      <w:r>
+        <w:rPr>
+          <w:rFonts w:ascii="Arial" w:hAnsi="Arial"/>
+          <w:b/>
+          <w:color w:val="333333"/>
+          <w:sz w:val="22"/>
+        </w:rPr>
+        <w:t>LU1 — Introduction to Infographics</w:t>
+        <w:tab/>
+        <w:t>8</w:t>
+      </w:r>
+    </w:p>
+    <w:p>
+      <w:pPr>
+        <w:tabs>
+          <w:tab w:pos="9072" w:val="right" w:leader="dot"/>
+        </w:tabs>
+        <w:spacing w:after="60"/>
+        <w:ind w:left="432"/>
+      </w:pPr>
+      <w:r>
+        <w:rPr>
+          <w:rFonts w:ascii="Arial" w:hAnsi="Arial"/>
+          <w:b w:val="0"/>
+          <w:color w:val="333333"/>
+          <w:sz w:val="21"/>
+        </w:rPr>
+        <w:t>Activity 1 — Use AI to Clean Data and Extract Insights</w:t>
+        <w:tab/>
+        <w:t>8</w:t>
+      </w:r>
+    </w:p>
+    <w:p>
+      <w:pPr>
+        <w:tabs>
+          <w:tab w:pos="9072" w:val="right" w:leader="dot"/>
+        </w:tabs>
+        <w:spacing w:after="60"/>
+        <w:ind w:left="432"/>
+      </w:pPr>
+      <w:r>
+        <w:rPr>
+          <w:rFonts w:ascii="Arial" w:hAnsi="Arial"/>
+          <w:b w:val="0"/>
+          <w:color w:val="333333"/>
+          <w:sz w:val="21"/>
+        </w:rPr>
+        <w:t>Activity 2 — Prompt an Evidence-Led Infographic Brief</w:t>
+        <w:tab/>
+        <w:t>11</w:t>
+      </w:r>
+    </w:p>
+    <w:p>
+      <w:pPr>
+        <w:tabs>
+          <w:tab w:pos="9072" w:val="right" w:leader="dot"/>
+        </w:tabs>
+        <w:spacing w:after="60"/>
+      </w:pPr>
+      <w:r>
+        <w:rPr>
+          <w:rFonts w:ascii="Arial" w:hAnsi="Arial"/>
+          <w:b/>
+          <w:color w:val="333333"/>
+          <w:sz w:val="22"/>
+        </w:rPr>
+        <w:t>LU2 — Create Infographics in PowerPoint</w:t>
+        <w:tab/>
+        <w:t>13</w:t>
+      </w:r>
+    </w:p>
+    <w:p>
+      <w:pPr>
+        <w:tabs>
+          <w:tab w:pos="9072" w:val="right" w:leader="dot"/>
+        </w:tabs>
+        <w:spacing w:after="60"/>
+        <w:ind w:left="432"/>
+      </w:pPr>
+      <w:r>
+        <w:rPr>
+          <w:rFonts w:ascii="Arial" w:hAnsi="Arial"/>
+          <w:b w:val="0"/>
+          <w:color w:val="333333"/>
+          <w:sz w:val="21"/>
+        </w:rPr>
+        <w:t>Activity 3 — Build from Microsoft Infographic Maker</w:t>
+        <w:tab/>
+        <w:t>13</w:t>
+      </w:r>
+    </w:p>
+    <w:p>
+      <w:pPr>
+        <w:tabs>
+          <w:tab w:pos="9072" w:val="right" w:leader="dot"/>
+        </w:tabs>
+        <w:spacing w:after="60"/>
+        <w:ind w:left="432"/>
+      </w:pPr>
+      <w:r>
+        <w:rPr>
+          <w:rFonts w:ascii="Arial" w:hAnsi="Arial"/>
+          <w:b w:val="0"/>
+          <w:color w:val="333333"/>
+          <w:sz w:val="21"/>
+        </w:rPr>
+        <w:t>Activity 4 — Generate Visual Assets and Refine Them in PowerPoint</w:t>
+        <w:tab/>
+        <w:t>15</w:t>
+      </w:r>
+    </w:p>
+    <w:p>
+      <w:pPr>
+        <w:tabs>
+          <w:tab w:pos="9072" w:val="right" w:leader="dot"/>
+        </w:tabs>
+        <w:spacing w:after="60"/>
+        <w:ind w:left="432"/>
+      </w:pPr>
+      <w:r>
+        <w:rPr>
+          <w:rFonts w:ascii="Arial" w:hAnsi="Arial"/>
+          <w:b w:val="0"/>
+          <w:color w:val="333333"/>
+          <w:sz w:val="21"/>
+        </w:rPr>
+        <w:t>Activity 5 — Use AI Analysis to Build a Native PowerPoint Data Story</w:t>
+        <w:tab/>
+        <w:t>18</w:t>
+      </w:r>
+    </w:p>
+    <w:p>
+      <w:pPr>
+        <w:tabs>
+          <w:tab w:pos="9072" w:val="right" w:leader="dot"/>
+        </w:tabs>
+        <w:spacing w:after="60"/>
+        <w:ind w:left="432"/>
+      </w:pPr>
+      <w:r>
+        <w:rPr>
+          <w:rFonts w:ascii="Arial" w:hAnsi="Arial"/>
+          <w:b w:val="0"/>
+          <w:color w:val="333333"/>
+          <w:sz w:val="21"/>
+        </w:rPr>
+        <w:t>Activity 6 — Compare Microsoft 365 Copilot and Gemini Notebook</w:t>
+        <w:tab/>
+        <w:t>20</w:t>
+      </w:r>
+    </w:p>
+    <w:p>
+      <w:pPr>
+        <w:tabs>
+          <w:tab w:pos="9072" w:val="right" w:leader="dot"/>
+        </w:tabs>
+        <w:spacing w:after="60"/>
+      </w:pPr>
+      <w:r>
+        <w:rPr>
+          <w:rFonts w:ascii="Arial" w:hAnsi="Arial"/>
+          <w:b/>
+          <w:color w:val="333333"/>
+          <w:sz w:val="22"/>
+        </w:rPr>
+        <w:t>LU3 — Review Infographics</w:t>
+        <w:tab/>
+        <w:t>23</w:t>
+      </w:r>
+    </w:p>
+    <w:p>
+      <w:pPr>
+        <w:tabs>
+          <w:tab w:pos="9072" w:val="right" w:leader="dot"/>
+        </w:tabs>
+        <w:spacing w:after="60"/>
+        <w:ind w:left="432"/>
+      </w:pPr>
+      <w:r>
+        <w:rPr>
+          <w:rFonts w:ascii="Arial" w:hAnsi="Arial"/>
+          <w:b w:val="0"/>
+          <w:color w:val="333333"/>
+          <w:sz w:val="21"/>
+        </w:rPr>
+        <w:t>Activity 7 — Peer Coaching and Story Review</w:t>
+        <w:tab/>
+        <w:t>23</w:t>
+      </w:r>
+    </w:p>
+    <w:p>
+      <w:pPr>
+        <w:tabs>
+          <w:tab w:pos="9072" w:val="right" w:leader="dot"/>
+        </w:tabs>
+        <w:spacing w:after="60"/>
+        <w:ind w:left="432"/>
+      </w:pPr>
+      <w:r>
+        <w:rPr>
+          <w:rFonts w:ascii="Arial" w:hAnsi="Arial"/>
+          <w:b w:val="0"/>
+          <w:color w:val="333333"/>
+          <w:sz w:val="21"/>
+        </w:rPr>
+        <w:t>Activity 8 — Budget and Effectiveness Decision</w:t>
+        <w:tab/>
+        <w:t>25</w:t>
+      </w:r>
+    </w:p>
+    <w:p>
+      <w:pPr>
+        <w:tabs>
+          <w:tab w:pos="9072" w:val="right" w:leader="dot"/>
+        </w:tabs>
+        <w:spacing w:after="60"/>
+      </w:pPr>
+      <w:r>
+        <w:rPr>
+          <w:rFonts w:ascii="Arial" w:hAnsi="Arial"/>
+          <w:b/>
+          <w:color w:val="333333"/>
+          <w:sz w:val="22"/>
+        </w:rPr>
+        <w:t>Quick PowerPoint Reference</w:t>
+        <w:tab/>
+        <w:t>27</w:t>
+      </w:r>
+    </w:p>
+    <w:p>
+      <w:pPr>
+        <w:tabs>
+          <w:tab w:pos="9072" w:val="right" w:leader="dot"/>
+        </w:tabs>
+        <w:spacing w:after="60"/>
+      </w:pPr>
+      <w:r>
+        <w:rPr>
+          <w:rFonts w:ascii="Arial" w:hAnsi="Arial"/>
+          <w:b/>
+          <w:color w:val="333333"/>
+          <w:sz w:val="22"/>
+        </w:rPr>
+        <w:t>Assessment</w:t>
+        <w:tab/>
+        <w:t>28</w:t>
+      </w:r>
+    </w:p>
+    <w:p>
+      <w:pPr>
+        <w:tabs>
+          <w:tab w:pos="9072" w:val="right" w:leader="dot"/>
+        </w:tabs>
+        <w:spacing w:after="60"/>
+      </w:pPr>
+      <w:r>
+        <w:rPr>
+          <w:rFonts w:ascii="Arial" w:hAnsi="Arial"/>
+          <w:b/>
+          <w:color w:val="333333"/>
+          <w:sz w:val="22"/>
+        </w:rPr>
+        <w:t>Assessment Flow</w:t>
+        <w:tab/>
+        <w:t>28</w:t>
+      </w:r>
+    </w:p>
+    <w:p>
+      <w:pPr>
+        <w:tabs>
+          <w:tab w:pos="9072" w:val="right" w:leader="dot"/>
+        </w:tabs>
+        <w:spacing w:after="60"/>
+      </w:pPr>
+      <w:r>
+        <w:rPr>
+          <w:rFonts w:ascii="Arial" w:hAnsi="Arial"/>
+          <w:b/>
+          <w:color w:val="333333"/>
+          <w:sz w:val="22"/>
+        </w:rPr>
+        <w:t>Sources and Further Reading</w:t>
+        <w:tab/>
+        <w:t>28</w:t>
+      </w:r>
+    </w:p>
+    <w:p>
+      <w:pPr>
+        <w:tabs>
+          <w:tab w:pos="9072" w:val="right" w:leader="dot"/>
+        </w:tabs>
+        <w:spacing w:after="60"/>
+      </w:pPr>
+      <w:r>
+        <w:rPr>
+          <w:rFonts w:ascii="Arial" w:hAnsi="Arial"/>
+          <w:b/>
+          <w:color w:val="333333"/>
+          <w:sz w:val="22"/>
+        </w:rPr>
+        <w:t>Support</w:t>
+        <w:tab/>
+        <w:t>28</w:t>
+      </w:r>
+    </w:p>
     <w:p>
       <w:r>
         <w:br w:type="page"/>
@@ -790,7 +936,7 @@
     </w:p>
     <w:p>
       <w:r>
-        <w:t>This guide supports Infographics and Data Visualization with PowerPoint (TGS-2024048310), a one-day WSQ course aligned to Infographics and Data Visualisation (TOU-DAT-4004-1.1-1). Use it with the visual course deck and the individual activity folders. The slides explain concepts and show worked examples; this guide carries the detailed procedures. Each activity folder is self-contained with CSV, Excel and PowerPoint files.</w:t>
+        <w:t>This guide supports Infographics and Data Visualization with PowerPoint (TGS-2026064178), a one-day WSQ course aligned to Infographics and Data Visualisation (TOU-DAT-4004-1.1-1). Use it with the visual course deck and the individual activity folders. The slides explain concepts and show worked examples; this guide carries the detailed procedures. Each activity folder is self-contained with prompts, mock CSV/Excel data, PowerPoint files and, where relevant, generated assets or a Gemini Notebook source pack.</w:t>
       </w:r>
     </w:p>
     <w:p>
@@ -824,7 +970,7 @@
         <w:pStyle w:val="ListBullet"/>
       </w:pPr>
       <w:r>
-        <w:t>Confirm that every activity folder contains INSTRUCTIONS.md, CHECKLIST.md, CSV, XLSX and PPTX files.</w:t>
+        <w:t>Confirm that every activity folder contains INSTRUCTIONS.md, CHECKLIST.md, PROMPTS.md, CSV, XLSX and PPTX files.</w:t>
       </w:r>
     </w:p>
     <w:p>
@@ -1148,55 +1294,191 @@
         <w:pStyle w:val="Heading1"/>
       </w:pPr>
       <w:r>
-        <w:t>Planning an Infographic</w:t>
-      </w:r>
-    </w:p>
-    <w:p>
-      <w:pPr>
-        <w:pStyle w:val="ListNumber"/>
-      </w:pPr>
-      <w:r>
-        <w:t>Define the audience, business question, intended action and success evidence.</w:t>
-      </w:r>
-    </w:p>
-    <w:p>
-      <w:pPr>
-        <w:pStyle w:val="ListNumber"/>
-      </w:pPr>
-      <w:r>
-        <w:t>Curate only accurate, relevant and high-impact content.</w:t>
-      </w:r>
-    </w:p>
-    <w:p>
-      <w:pPr>
-        <w:pStyle w:val="ListNumber"/>
-      </w:pPr>
-      <w:r>
-        <w:t>Choose metrics with consistent units, periods and denominators.</w:t>
-      </w:r>
-    </w:p>
-    <w:p>
-      <w:pPr>
-        <w:pStyle w:val="ListNumber"/>
-      </w:pPr>
-      <w:r>
-        <w:t>Select the infographic form that reveals the required relationship.</w:t>
-      </w:r>
-    </w:p>
-    <w:p>
-      <w:pPr>
-        <w:pStyle w:val="ListNumber"/>
-      </w:pPr>
-      <w:r>
-        <w:t>Sketch a low-fidelity wireframe with title, context, evidence, flow, action and source space.</w:t>
-      </w:r>
-    </w:p>
-    <w:p>
-      <w:pPr>
-        <w:pStyle w:val="ListNumber"/>
-      </w:pPr>
-      <w:r>
-        <w:t>Test reading order at thumbnail size before applying colour or imagery.</w:t>
+        <w:t>AI-First Data-to-Infographic Workflow</w:t>
+      </w:r>
+    </w:p>
+    <w:p>
+      <w:r>
+        <w:t>The default modern workflow is not to construct a full infographic manually from a blank slide. Use approved AI tools to accelerate source organisation, data cleanup, analysis, insight extraction and first-draft visual generation. Use Excel and the original sources to verify evidence, then use PowerPoint as the editable refinement, presentation and release layer.</w:t>
+      </w:r>
+    </w:p>
+    <w:p>
+      <w:r>
+        <w:rPr>
+          <w:b/>
+        </w:rPr>
+        <w:t xml:space="preserve">Collect — </w:t>
+      </w:r>
+      <w:r>
+        <w:t>Approved files, URLs, transcripts and datasets; record origin and access date.</w:t>
+      </w:r>
+    </w:p>
+    <w:p>
+      <w:r>
+        <w:rPr>
+          <w:b/>
+        </w:rPr>
+        <w:t xml:space="preserve">Clean — </w:t>
+      </w:r>
+      <w:r>
+        <w:t>Remove duplicates, standardise units and labels, identify missing values and retain the raw source.</w:t>
+      </w:r>
+    </w:p>
+    <w:p>
+      <w:r>
+        <w:rPr>
+          <w:b/>
+        </w:rPr>
+        <w:t xml:space="preserve">Analyse — </w:t>
+      </w:r>
+      <w:r>
+        <w:t>Ask AI for patterns, exceptions and comparisons, then reproduce critical calculations in Excel.</w:t>
+      </w:r>
+    </w:p>
+    <w:p>
+      <w:r>
+        <w:rPr>
+          <w:b/>
+        </w:rPr>
+        <w:t xml:space="preserve">Extract — </w:t>
+      </w:r>
+      <w:r>
+        <w:t>Write show–mean–matter–act insights with citations, caveats and forbidden claims.</w:t>
+      </w:r>
+    </w:p>
+    <w:p>
+      <w:r>
+        <w:rPr>
+          <w:b/>
+        </w:rPr>
+        <w:t xml:space="preserve">Generate — </w:t>
+      </w:r>
+      <w:r>
+        <w:t>Create infographic or slide-deck options from the verified brief and source pack.</w:t>
+      </w:r>
+    </w:p>
+    <w:p>
+      <w:r>
+        <w:rPr>
+          <w:b/>
+        </w:rPr>
+        <w:t xml:space="preserve">PowerPoint — </w:t>
+      </w:r>
+      <w:r>
+        <w:t>Download or rebuild in PPTX; restore editability, charts, source labels, brand and accessibility.</w:t>
+      </w:r>
+    </w:p>
+    <w:p>
+      <w:r>
+        <w:rPr>
+          <w:b/>
+        </w:rPr>
+        <w:t xml:space="preserve">Verify — </w:t>
+      </w:r>
+      <w:r>
+        <w:t>Compare every claim to source, record prompts and human changes, approve and export.</w:t>
+      </w:r>
+    </w:p>
+    <w:p>
+      <w:r>
+        <w:rPr>
+          <w:b/>
+          <w:color w:val="1F6FEB"/>
+        </w:rPr>
+        <w:t>Data and insight verification gate</w:t>
+      </w:r>
+    </w:p>
+    <w:p>
+      <w:pPr>
+        <w:pStyle w:val="ListBullet"/>
+      </w:pPr>
+      <w:r>
+        <w:t>Keep the untouched raw source and create a source register before cleanup.</w:t>
+      </w:r>
+    </w:p>
+    <w:p>
+      <w:pPr>
+        <w:pStyle w:val="ListBullet"/>
+      </w:pPr>
+      <w:r>
+        <w:t>Require AI to list proposed transformations, missing data, conflicting definitions and assumptions.</w:t>
+      </w:r>
+    </w:p>
+    <w:p>
+      <w:pPr>
+        <w:pStyle w:val="ListBullet"/>
+      </w:pPr>
+      <w:r>
+        <w:t>Reproduce decision-critical totals, percentages, differences and trends with Excel formulas.</w:t>
+      </w:r>
+    </w:p>
+    <w:p>
+      <w:pPr>
+        <w:pStyle w:val="ListBullet"/>
+      </w:pPr>
+      <w:r>
+        <w:t>Separate observation from interpretation; add caveats, confidence and forbidden claims.</w:t>
+      </w:r>
+    </w:p>
+    <w:p>
+      <w:pPr>
+        <w:pStyle w:val="ListBullet"/>
+      </w:pPr>
+      <w:r>
+        <w:t>Treat AI as an assistant, not as the source of truth or final owner.</w:t>
+      </w:r>
+    </w:p>
+    <w:p>
+      <w:r>
+        <w:rPr>
+          <w:b/>
+          <w:color w:val="1F6FEB"/>
+        </w:rPr>
+        <w:t>Copy-ready prompt patterns</w:t>
+      </w:r>
+    </w:p>
+    <w:p>
+      <w:r>
+        <w:rPr>
+          <w:b/>
+        </w:rPr>
+        <w:t xml:space="preserve">Data analyst — </w:t>
+      </w:r>
+      <w:r>
+        <w:t>Using only the attached approved sources, create a source register, identify duplicates or conflicting definitions, clean the table, show formulas or transformations, and return five candidate insights with citations, caveats and a confidence note. Do not invent missing values.</w:t>
+      </w:r>
+    </w:p>
+    <w:p>
+      <w:r>
+        <w:rPr>
+          <w:b/>
+        </w:rPr>
+        <w:t xml:space="preserve">Infographic — </w:t>
+      </w:r>
+      <w:r>
+        <w:t>Create a one-page executive infographic for Singapore retail managers. Lead with one decision insight, show three supporting metrics, include a five-stage flow and a source footer. Use a clean professional style, strong hierarchy and no invented data. Leave critical labels editable.</w:t>
+      </w:r>
+    </w:p>
+    <w:p>
+      <w:r>
+        <w:rPr>
+          <w:b/>
+        </w:rPr>
+        <w:t xml:space="preserve">Text to image — </w:t>
+      </w:r>
+      <w:r>
+        <w:t>Create a clean vector-like sustainability delivery illustration for a PowerPoint infographic: one electric van, one reusable parcel, a simple route and a feedback symbol. Transparent background, consistent blue/teal/violet/amber palette, no text, no logo, no watermark.</w:t>
+      </w:r>
+    </w:p>
+    <w:p>
+      <w:r>
+        <w:rPr>
+          <w:b/>
+        </w:rPr>
+        <w:t xml:space="preserve">Gemini Notebook deck — </w:t>
+      </w:r>
+      <w:r>
+        <w:t>Create Presenter Slides for business stakeholders. Focus on the verified decision insight, use a concise professional style, include source-grounded comparisons and a final recommendation. Avoid claims not supported by selected sources. Download PowerPoint when available; otherwise download PDF and identify what must be rebuilt as editable native PowerPoint objects.</w:t>
       </w:r>
     </w:p>
     <w:p>
@@ -1530,14 +1812,285 @@
         <w:pStyle w:val="Heading1"/>
       </w:pPr>
       <w:r>
-        <w:t>Microsoft Infographic Maker and AI Designer</w:t>
-      </w:r>
-    </w:p>
-    <w:p>
-      <w:r>
-        <w:t>Microsoft's current infographic-maker page describes editable templates for timelines, flowcharts, roadmaps, organisation charts and posters, plus icons, stock images, SmartArt, charts, Excel data, branding, collaboration and export. The AI Designer/Copilot page describes generation and refinement of layouts, slide content and AI images. Capabilities depend on account, plan, administrator settings and product rollout; verify availability before class.</w:t>
-      </w:r>
-    </w:p>
+        <w:t>Microsoft 365 Copilot and Gemini Notebook</w:t>
+      </w:r>
+    </w:p>
+    <w:p>
+      <w:r>
+        <w:t>Microsoft 365 Copilot can create an infographic from a detailed prompt and, where available, an uploaded file. Learners can select brand and colour options, choose Portrait or Wide, generate alternatives and edit or download the result. Copilot in PowerPoint can also create, restructure and refine slides. Availability depends on licence, region, administrator settings and current product rollout.</w:t>
+      </w:r>
+    </w:p>
+    <w:p>
+      <w:r>
+        <w:rPr>
+          <w:b/>
+          <w:color w:val="1F6FEB"/>
+        </w:rPr>
+        <w:t>Gemini Notebook: sources to infographic and PowerPoint</w:t>
+      </w:r>
+    </w:p>
+    <w:p>
+      <w:pPr>
+        <w:pStyle w:val="ListNumber"/>
+      </w:pPr>
+      <w:r>
+        <w:t>Create a notebook and add approved files, websites, pasted text or supported YouTube sources. Select only the sources needed for the brief.</w:t>
+      </w:r>
+    </w:p>
+    <w:p>
+      <w:pPr>
+        <w:pStyle w:val="ListNumber"/>
+      </w:pPr>
+      <w:r>
+        <w:t>In Studio choose Infographic. Use the pencil control to set language, level of detail, orientation, visual style and a custom prompt. Generate, inspect and download the PNG.</w:t>
+      </w:r>
+    </w:p>
+    <w:p>
+      <w:pPr>
+        <w:pStyle w:val="ListNumber"/>
+      </w:pPr>
+      <w:r>
+        <w:t>In Studio choose Slide Deck. Select Presenter Slides for a visual speaking deck or Detailed Deck for a reading document; set language, length and the common prompt.</w:t>
+      </w:r>
+    </w:p>
+    <w:p>
+      <w:pPr>
+        <w:pStyle w:val="ListNumber"/>
+      </w:pPr>
+      <w:r>
+        <w:t>Inspect the generated deck. Use the three-dot menu to Download PowerPoint (.pptx) where that option is available. If the interface exposes only PDF, preserve the PDF and rebuild decision-critical content as native PowerPoint objects; do not assume a PDF conversion is fully editable.</w:t>
+      </w:r>
+    </w:p>
+    <w:p>
+      <w:pPr>
+        <w:pStyle w:val="ListNumber"/>
+      </w:pPr>
+      <w:r>
+        <w:t>Gemini Notebook infographics and decks may contain visual or factual inaccuracies. During slide revisions, sources may not be re-checked, so verify every changed claim again.</w:t>
+      </w:r>
+    </w:p>
+    <w:tbl>
+      <w:tblPr>
+        <w:tblStyle w:val="TableGrid"/>
+        <w:tblW w:type="auto" w:w="0"/>
+        <w:tblLook w:firstColumn="1" w:firstRow="1" w:lastColumn="0" w:lastRow="0" w:noHBand="0" w:noVBand="1" w:val="04A0"/>
+      </w:tblPr>
+      <w:tblGrid>
+        <w:gridCol w:w="2880"/>
+        <w:gridCol w:w="2880"/>
+        <w:gridCol w:w="2880"/>
+      </w:tblGrid>
+      <w:tr>
+        <w:tc>
+          <w:tcPr>
+            <w:tcW w:type="dxa" w:w="2880"/>
+            <w:shd w:val="clear" w:color="auto" w:fill="1F6FEB"/>
+          </w:tcPr>
+          <w:p>
+            <w:r/>
+            <w:r>
+              <w:rPr>
+                <w:b/>
+                <w:color w:val="FFFFFF"/>
+              </w:rPr>
+              <w:t>Criterion</w:t>
+            </w:r>
+          </w:p>
+        </w:tc>
+        <w:tc>
+          <w:tcPr>
+            <w:tcW w:type="dxa" w:w="2880"/>
+            <w:shd w:val="clear" w:color="auto" w:fill="1F6FEB"/>
+          </w:tcPr>
+          <w:p>
+            <w:r/>
+            <w:r>
+              <w:rPr>
+                <w:b/>
+                <w:color w:val="FFFFFF"/>
+              </w:rPr>
+              <w:t>Microsoft 365 Copilot</w:t>
+            </w:r>
+          </w:p>
+        </w:tc>
+        <w:tc>
+          <w:tcPr>
+            <w:tcW w:type="dxa" w:w="2880"/>
+            <w:shd w:val="clear" w:color="auto" w:fill="1F6FEB"/>
+          </w:tcPr>
+          <w:p>
+            <w:r/>
+            <w:r>
+              <w:rPr>
+                <w:b/>
+                <w:color w:val="FFFFFF"/>
+              </w:rPr>
+              <w:t>Gemini Notebook</w:t>
+            </w:r>
+          </w:p>
+        </w:tc>
+      </w:tr>
+      <w:tr>
+        <w:tc>
+          <w:tcPr>
+            <w:tcW w:type="dxa" w:w="2880"/>
+          </w:tcPr>
+          <w:p>
+            <w:r>
+              <w:t>Starting point</w:t>
+            </w:r>
+          </w:p>
+        </w:tc>
+        <w:tc>
+          <w:tcPr>
+            <w:tcW w:type="dxa" w:w="2880"/>
+          </w:tcPr>
+          <w:p>
+            <w:r>
+              <w:t>Prompt or uploaded file in Microsoft 365 Copilot</w:t>
+            </w:r>
+          </w:p>
+        </w:tc>
+        <w:tc>
+          <w:tcPr>
+            <w:tcW w:type="dxa" w:w="2880"/>
+          </w:tcPr>
+          <w:p>
+            <w:r>
+              <w:t>Selected notebook sources: files, URLs, text or YouTube</w:t>
+            </w:r>
+          </w:p>
+        </w:tc>
+      </w:tr>
+      <w:tr>
+        <w:tc>
+          <w:tcPr>
+            <w:tcW w:type="dxa" w:w="2880"/>
+          </w:tcPr>
+          <w:p>
+            <w:r>
+              <w:t>Best use</w:t>
+            </w:r>
+          </w:p>
+        </w:tc>
+        <w:tc>
+          <w:tcPr>
+            <w:tcW w:type="dxa" w:w="2880"/>
+          </w:tcPr>
+          <w:p>
+            <w:r>
+              <w:t>Direct infographic creation and editing within the Microsoft ecosystem</w:t>
+            </w:r>
+          </w:p>
+        </w:tc>
+        <w:tc>
+          <w:tcPr>
+            <w:tcW w:type="dxa" w:w="2880"/>
+          </w:tcPr>
+          <w:p>
+            <w:r>
+              <w:t>Source-grounded synthesis into an infographic or multi-slide narrative</w:t>
+            </w:r>
+          </w:p>
+        </w:tc>
+      </w:tr>
+      <w:tr>
+        <w:tc>
+          <w:tcPr>
+            <w:tcW w:type="dxa" w:w="2880"/>
+          </w:tcPr>
+          <w:p>
+            <w:r>
+              <w:t>PowerPoint hand-off</w:t>
+            </w:r>
+          </w:p>
+        </w:tc>
+        <w:tc>
+          <w:tcPr>
+            <w:tcW w:type="dxa" w:w="2880"/>
+          </w:tcPr>
+          <w:p>
+            <w:r>
+              <w:t>Copy/download or continue editing in Microsoft tools</w:t>
+            </w:r>
+          </w:p>
+        </w:tc>
+        <w:tc>
+          <w:tcPr>
+            <w:tcW w:type="dxa" w:w="2880"/>
+          </w:tcPr>
+          <w:p>
+            <w:r>
+              <w:t>Download .pptx where available; otherwise preserve PDF and rebuild critical content in PowerPoint</w:t>
+            </w:r>
+          </w:p>
+        </w:tc>
+      </w:tr>
+      <w:tr>
+        <w:tc>
+          <w:tcPr>
+            <w:tcW w:type="dxa" w:w="2880"/>
+          </w:tcPr>
+          <w:p>
+            <w:r>
+              <w:t>Control</w:t>
+            </w:r>
+          </w:p>
+        </w:tc>
+        <w:tc>
+          <w:tcPr>
+            <w:tcW w:type="dxa" w:w="2880"/>
+          </w:tcPr>
+          <w:p>
+            <w:r>
+              <w:t>Brand kit, orientation, prompt and visual editor where available</w:t>
+            </w:r>
+          </w:p>
+        </w:tc>
+        <w:tc>
+          <w:tcPr>
+            <w:tcW w:type="dxa" w:w="2880"/>
+          </w:tcPr>
+          <w:p>
+            <w:r>
+              <w:t>Source selection, format, language, length, orientation/detail/style and custom prompt</w:t>
+            </w:r>
+          </w:p>
+        </w:tc>
+      </w:tr>
+      <w:tr>
+        <w:tc>
+          <w:tcPr>
+            <w:tcW w:type="dxa" w:w="2880"/>
+          </w:tcPr>
+          <w:p>
+            <w:r>
+              <w:t>Review risk</w:t>
+            </w:r>
+          </w:p>
+        </w:tc>
+        <w:tc>
+          <w:tcPr>
+            <w:tcW w:type="dxa" w:w="2880"/>
+          </w:tcPr>
+          <w:p>
+            <w:r>
+              <w:t>Availability, editability and generated claims vary by licence and output</w:t>
+            </w:r>
+          </w:p>
+        </w:tc>
+        <w:tc>
+          <w:tcPr>
+            <w:tcW w:type="dxa" w:w="2880"/>
+          </w:tcPr>
+          <w:p>
+            <w:r>
+              <w:t>Infographics/decks may contain visual or factual errors; revisions may not re-check sources</w:t>
+            </w:r>
+          </w:p>
+        </w:tc>
+      </w:tr>
+    </w:tbl>
     <w:p>
       <w:r>
         <w:rPr>
@@ -1828,7 +2381,7 @@
         <w:pStyle w:val="ListBullet"/>
       </w:pPr>
       <w:r>
-        <w:t>Planning moves from objective and audience to content curation, metric selection, structure and a low-fidelity wireframe.</w:t>
+        <w:t>An AI-first workflow gathers approved sources, cleans and analyses data, extracts candidate insights, then routes verified evidence into visual generation.</w:t>
       </w:r>
     </w:p>
     <w:p>
@@ -1844,7 +2397,7 @@
         <w:pStyle w:val="Heading2"/>
       </w:pPr>
       <w:r>
-        <w:t>Activity 1 — Decode a Customer Survey Infographic</w:t>
+        <w:t>Activity 1 — Use AI to Clean Data and Extract Insights</w:t>
       </w:r>
     </w:p>
     <w:p>
@@ -1855,7 +2408,7 @@
         <w:t xml:space="preserve">Objective: </w:t>
       </w:r>
       <w:r>
-        <w:t>Extract defensible insights from a statistical infographic and connect them to a business action.</w:t>
+        <w:t>Use ai to organise and clean approved mock sources, then verify and convert candidate patterns into defensible business insights.</w:t>
       </w:r>
     </w:p>
     <w:p>
@@ -1866,7 +2419,7 @@
         <w:t xml:space="preserve">Output: </w:t>
       </w:r>
       <w:r>
-        <w:t>An annotated insight slide plus a one-sentence recommendation (35 minutes).</w:t>
+        <w:t>A cleaned analysis workbook, AI prompt/source log, annotated insight slide and one-sentence recommendation (35 minutes).</w:t>
       </w:r>
     </w:p>
     <w:p>
@@ -1885,7 +2438,57 @@
     </w:p>
     <w:p>
       <w:r>
-        <w:t>Use the supplied CSV, workbook and sample deck to separate observations from interpretations and recommend one next step without overstating the evidence.</w:t>
+        <w:t>Use an approved AI assistant with the supplied CSV, workbook and source notes to produce a clean analysis and candidate insights. Verify every number in Excel before recommending one next step.</w:t>
+      </w:r>
+    </w:p>
+    <w:p>
+      <w:pPr>
+        <w:jc w:val="center"/>
+      </w:pPr>
+      <w:r>
+        <w:drawing>
+          <wp:inline xmlns:a="http://schemas.openxmlformats.org/drawingml/2006/main" xmlns:pic="http://schemas.openxmlformats.org/drawingml/2006/picture">
+            <wp:extent cx="5623560" cy="3165261"/>
+            <wp:docPr id="2" name="Picture 2"/>
+            <wp:cNvGraphicFramePr>
+              <a:graphicFrameLocks noChangeAspect="1"/>
+            </wp:cNvGraphicFramePr>
+            <a:graphic>
+              <a:graphicData uri="http://schemas.openxmlformats.org/drawingml/2006/picture">
+                <pic:pic>
+                  <pic:nvPicPr>
+                    <pic:cNvPr id="0" name="A01.png"/>
+                    <pic:cNvPicPr/>
+                  </pic:nvPicPr>
+                  <pic:blipFill>
+                    <a:blip r:embed="rId10"/>
+                    <a:stretch>
+                      <a:fillRect/>
+                    </a:stretch>
+                  </pic:blipFill>
+                  <pic:spPr>
+                    <a:xfrm>
+                      <a:off x="0" y="0"/>
+                      <a:ext cx="5623560" cy="3165261"/>
+                    </a:xfrm>
+                    <a:prstGeom prst="rect"/>
+                  </pic:spPr>
+                </pic:pic>
+              </a:graphicData>
+            </a:graphic>
+          </wp:inline>
+        </w:drawing>
+      </w:r>
+    </w:p>
+    <w:p>
+      <w:pPr>
+        <w:jc w:val="center"/>
+      </w:pPr>
+      <w:r>
+        <w:rPr>
+          <w:i/>
+        </w:rPr>
+        <w:t>Activity 1 workflow/output preview — use the editable PPTX in the activity folder.</w:t>
       </w:r>
     </w:p>
     <w:p>
@@ -1908,10 +2511,10 @@
         <w:rPr>
           <w:b/>
         </w:rPr>
-        <w:t xml:space="preserve">Open the evidence pack — </w:t>
-      </w:r>
-      <w:r>
-        <w:t>Open A01-Customer-Pulse-Data.xlsx and review the Data, Definitions and Checks sheets. Confirm the survey period, sample size, units and segment names before interpreting a chart.</w:t>
+        <w:t xml:space="preserve">Register the sources — </w:t>
+      </w:r>
+      <w:r>
+        <w:t>Open the A01 XLSX, CSV and Source Notes sheet. In the AI Prompt Lab record each source, its period, data status, owner and permitted use before uploading anything.</w:t>
       </w:r>
     </w:p>
     <w:p>
@@ -1925,10 +2528,10 @@
         <w:rPr>
           <w:b/>
         </w:rPr>
-        <w:t xml:space="preserve">Open the sample presentation — </w:t>
-      </w:r>
-      <w:r>
-        <w:t>Open A01-Customer-Pulse-Start.pptx. Save a working copy as A01-&lt;YourName&gt;-Customer-Pulse.pptx.</w:t>
+        <w:t xml:space="preserve">Preserve the raw data — </w:t>
+      </w:r>
+      <w:r>
+        <w:t>Save a named working copy. Do not modify or replace the raw CSV; perform cleanup on a separate worksheet or in an approved AI session.</w:t>
       </w:r>
     </w:p>
     <w:p>
@@ -1942,10 +2545,10 @@
         <w:rPr>
           <w:b/>
         </w:rPr>
-        <w:t xml:space="preserve">Read the visual literally — </w:t>
-      </w:r>
-      <w:r>
-        <w:t>On the first slide, write three observations that use visible values only. Use comparison language such as higher, lower, largest gap or changed by; do not use causal language.</w:t>
+        <w:t xml:space="preserve">Run the data-cleaning prompt — </w:t>
+      </w:r>
+      <w:r>
+        <w:t>Copy the Data analyst prompt from PROMPTS.md. Ask the AI to flag duplicates, missing values, inconsistent labels, units and periods and to describe every proposed transformation. Require no invented values.</w:t>
       </w:r>
     </w:p>
     <w:p>
@@ -1959,10 +2562,10 @@
         <w:rPr>
           <w:b/>
         </w:rPr>
-        <w:t xml:space="preserve">Check the denominator — </w:t>
-      </w:r>
-      <w:r>
-        <w:t>Return to the workbook and compare segment response counts. Note any segment whose smaller base makes the percentage less stable.</w:t>
+        <w:t xml:space="preserve">Verify the cleanup — </w:t>
+      </w:r>
+      <w:r>
+        <w:t>Compare the AI response with the raw CSV. Apply only justified changes in the workbook, retain a before/after note and confirm the response count remains 420.</w:t>
       </w:r>
     </w:p>
     <w:p>
@@ -1976,10 +2579,10 @@
         <w:rPr>
           <w:b/>
         </w:rPr>
-        <w:t xml:space="preserve">Write the insight chain — </w:t>
-      </w:r>
-      <w:r>
-        <w:t>Complete the four labelled boxes: What it shows; What it may mean; Why it matters; What action is justified.</w:t>
+        <w:t xml:space="preserve">Ask for candidate insights — </w:t>
+      </w:r>
+      <w:r>
+        <w:t>Request the largest, smallest, gap, exception and competing explanation. Require each candidate insight to cite the exact rows or source fields used.</w:t>
       </w:r>
     </w:p>
     <w:p>
@@ -1993,10 +2596,10 @@
         <w:rPr>
           <w:b/>
         </w:rPr>
-        <w:t xml:space="preserve">Add one annotation — </w:t>
-      </w:r>
-      <w:r>
-        <w:t>In PowerPoint select Insert &gt; Shapes &gt; Callouts. Point the callout at the strongest pattern and enter a short direct label.</w:t>
+        <w:t xml:space="preserve">Reproduce the calculations — </w:t>
+      </w:r>
+      <w:r>
+        <w:t>Use the Analysis sheet and Excel formulas to reproduce every critical difference or percentage. Reject any AI claim that cannot be reproduced.</w:t>
       </w:r>
     </w:p>
     <w:p>
@@ -2010,10 +2613,10 @@
         <w:rPr>
           <w:b/>
         </w:rPr>
-        <w:t xml:space="preserve">Add source context — </w:t>
-      </w:r>
-      <w:r>
-        <w:t>Add a footer line containing Synthetic Northstar Retail data, Q2 2026, n=420. Keep it readable without competing with the insight.</w:t>
+        <w:t xml:space="preserve">Write the insight chain — </w:t>
+      </w:r>
+      <w:r>
+        <w:t>Complete What it shows; What it may mean; Why it matters; What action is justified. Add one caveat or confidence note.</w:t>
       </w:r>
     </w:p>
     <w:p>
@@ -2027,10 +2630,10 @@
         <w:rPr>
           <w:b/>
         </w:rPr>
-        <w:t xml:space="preserve">Self-check the claim — </w:t>
-      </w:r>
-      <w:r>
-        <w:t>Ask whether a sceptical reader could reproduce the statement from the workbook. Replace any unsupported cause-and-effect wording.</w:t>
+        <w:t xml:space="preserve">Build the PowerPoint evidence — </w:t>
+      </w:r>
+      <w:r>
+        <w:t>Open the A01 start PPTX, save a working copy, add one editable annotation and show Synthetic Northstar Retail data, Q2 2026, n=420 in the source footer.</w:t>
       </w:r>
     </w:p>
     <w:p>
@@ -2044,12 +2647,44 @@
         <w:rPr>
           <w:b/>
         </w:rPr>
-        <w:t xml:space="preserve">Submit the evidence — </w:t>
-      </w:r>
-      <w:r>
-        <w:t>Save the PPTX and update CHECKLIST.md. Keep the CSV and workbook in the folder as the traceable evidence pack.</w:t>
-      </w:r>
-    </w:p>
+        <w:t xml:space="preserve">Complete the prompt log — </w:t>
+      </w:r>
+      <w:r>
+        <w:t>Record the AI tool, full prompt, approved inputs, output reviewed, rejected claims, human changes, reviewer and final owner.</w:t>
+      </w:r>
+    </w:p>
+    <w:p>
+      <w:r>
+        <w:rPr>
+          <w:b/>
+          <w:color w:val="1F6FEB"/>
+        </w:rPr>
+        <w:t>Test it</w:t>
+      </w:r>
+    </w:p>
+    <w:tbl>
+      <w:tblPr>
+        <w:tblStyle w:val="TableGrid"/>
+        <w:tblW w:type="auto" w:w="0"/>
+        <w:tblLook w:firstColumn="1" w:firstRow="1" w:lastColumn="0" w:lastRow="0" w:noHBand="0" w:noVBand="1" w:val="04A0"/>
+      </w:tblPr>
+      <w:tblGrid>
+        <w:gridCol w:w="8640"/>
+      </w:tblGrid>
+      <w:tr>
+        <w:tc>
+          <w:tcPr>
+            <w:tcW w:type="dxa" w:w="8640"/>
+            <w:shd w:val="clear" w:color="auto" w:fill="E8F7EE"/>
+          </w:tcPr>
+          <w:p>
+            <w:r>
+              <w:t>Change one value in a named workbook copy. Recalculate the insight and confirm the PowerPoint claim, source note and caveat still agree.</w:t>
+            </w:r>
+          </w:p>
+        </w:tc>
+      </w:tr>
+    </w:tbl>
     <w:p>
       <w:r>
         <w:rPr>
@@ -2320,7 +2955,7 @@
         <w:pStyle w:val="Heading2"/>
       </w:pPr>
       <w:r>
-        <w:t>Activity 2 — Plan the Infographic Brief and Wireframe</w:t>
+        <w:t>Activity 2 — Prompt an Evidence-Led Infographic Brief</w:t>
       </w:r>
     </w:p>
     <w:p>
@@ -2331,7 +2966,7 @@
         <w:t xml:space="preserve">Objective: </w:t>
       </w:r>
       <w:r>
-        <w:t>Select an infographic type and build a low-fidelity wireframe from an audience question and curated evidence.</w:t>
+        <w:t>Turn verified insights into a structured ai brief and prompt that controls audience, message, evidence, form and output.</w:t>
       </w:r>
     </w:p>
     <w:p>
@@ -2342,7 +2977,7 @@
         <w:t xml:space="preserve">Output: </w:t>
       </w:r>
       <w:r>
-        <w:t>A portrait infographic brief and low-fidelity PowerPoint wireframe (35 minutes).</w:t>
+        <w:t>A structured prompt brief, two AI wireframe directions and one approved PowerPoint wireframe (35 minutes).</w:t>
       </w:r>
     </w:p>
     <w:p>
@@ -2361,7 +2996,57 @@
     </w:p>
     <w:p>
       <w:r>
-        <w:t>Create a wireframe that can later be built manually, from a Microsoft infographic template or with AI assistance without changing the approved message.</w:t>
+        <w:t>Use the supplied prompt workbook to ask AI for two wireframe directions. Select one by evidence fit, then preserve it as the control brief for Microsoft 365 Copilot, Gemini Notebook or PowerPoint.</w:t>
+      </w:r>
+    </w:p>
+    <w:p>
+      <w:pPr>
+        <w:jc w:val="center"/>
+      </w:pPr>
+      <w:r>
+        <w:drawing>
+          <wp:inline xmlns:a="http://schemas.openxmlformats.org/drawingml/2006/main" xmlns:pic="http://schemas.openxmlformats.org/drawingml/2006/picture">
+            <wp:extent cx="5623560" cy="3165261"/>
+            <wp:docPr id="3" name="Picture 3"/>
+            <wp:cNvGraphicFramePr>
+              <a:graphicFrameLocks noChangeAspect="1"/>
+            </wp:cNvGraphicFramePr>
+            <a:graphic>
+              <a:graphicData uri="http://schemas.openxmlformats.org/drawingml/2006/picture">
+                <pic:pic>
+                  <pic:nvPicPr>
+                    <pic:cNvPr id="0" name="A02.png"/>
+                    <pic:cNvPicPr/>
+                  </pic:nvPicPr>
+                  <pic:blipFill>
+                    <a:blip r:embed="rId11"/>
+                    <a:stretch>
+                      <a:fillRect/>
+                    </a:stretch>
+                  </pic:blipFill>
+                  <pic:spPr>
+                    <a:xfrm>
+                      <a:off x="0" y="0"/>
+                      <a:ext cx="5623560" cy="3165261"/>
+                    </a:xfrm>
+                    <a:prstGeom prst="rect"/>
+                  </pic:spPr>
+                </pic:pic>
+              </a:graphicData>
+            </a:graphic>
+          </wp:inline>
+        </w:drawing>
+      </w:r>
+    </w:p>
+    <w:p>
+      <w:pPr>
+        <w:jc w:val="center"/>
+      </w:pPr>
+      <w:r>
+        <w:rPr>
+          <w:i/>
+        </w:rPr>
+        <w:t>Activity 2 workflow/output preview — use the editable PPTX in the activity folder.</w:t>
       </w:r>
     </w:p>
     <w:p>
@@ -2384,10 +3069,10 @@
         <w:rPr>
           <w:b/>
         </w:rPr>
-        <w:t xml:space="preserve">Open the brief template — </w:t>
-      </w:r>
-      <w:r>
-        <w:t>Open A02-Infographic-Brief-and-Wireframe.pptx and save a working copy.</w:t>
+        <w:t xml:space="preserve">Open the brief and prompt pack — </w:t>
+      </w:r>
+      <w:r>
+        <w:t>Open the A02 workbook, PROMPTS.md and start PPTX. Save named working copies and select only the verified A01 insight chain as input.</w:t>
       </w:r>
     </w:p>
     <w:p>
@@ -2401,10 +3086,10 @@
         <w:rPr>
           <w:b/>
         </w:rPr>
-        <w:t xml:space="preserve">Write the audience question — </w:t>
-      </w:r>
-      <w:r>
-        <w:t>In the Brief slide complete Audience, Business question, Desired action and Success evidence in one sentence each.</w:t>
+        <w:t xml:space="preserve">Define the control brief — </w:t>
+      </w:r>
+      <w:r>
+        <w:t>Complete Audience, Business question, Desired action, Success evidence, approved claims, forbidden claims, output channel and owner.</w:t>
       </w:r>
     </w:p>
     <w:p>
@@ -2418,10 +3103,10 @@
         <w:rPr>
           <w:b/>
         </w:rPr>
-        <w:t xml:space="preserve">Open the data pack — </w:t>
-      </w:r>
-      <w:r>
-        <w:t>Review A02-Sustainable-Delivery-Data.xlsx and its Definitions sheet. Mark the five stages and the one metric that matters at each stage.</w:t>
+        <w:t xml:space="preserve">Choose the infographic form — </w:t>
+      </w:r>
+      <w:r>
+        <w:t>Select timeline, process, comparison, statistical, hierarchy or hybrid. Explain why it reveals the relationship better than two alternatives.</w:t>
       </w:r>
     </w:p>
     <w:p>
@@ -2435,10 +3120,10 @@
         <w:rPr>
           <w:b/>
         </w:rPr>
-        <w:t xml:space="preserve">Choose the infographic form — </w:t>
-      </w:r>
-      <w:r>
-        <w:t>Select timeline, process, comparison, statistical, hierarchy or hybrid. In the rationale box explain why it reveals the relationship better than two alternatives.</w:t>
+        <w:t xml:space="preserve">Write the structured prompt — </w:t>
+      </w:r>
+      <w:r>
+        <w:t>Use the prompt anatomy in the workbook: role, audience, objective, approved evidence, hierarchy, format, brand, accessibility, constraints and output.</w:t>
       </w:r>
     </w:p>
     <w:p>
@@ -2452,10 +3137,10 @@
         <w:rPr>
           <w:b/>
         </w:rPr>
-        <w:t xml:space="preserve">Set the portrait canvas — </w:t>
-      </w:r>
-      <w:r>
-        <w:t>Choose Design &gt; Slide Size &gt; Custom Slide Size. Set Slides sized for to Custom, Width 21 cm and Height 29.7 cm, select Portrait, then choose Ensure Fit.</w:t>
+        <w:t xml:space="preserve">Request two directions — </w:t>
+      </w:r>
+      <w:r>
+        <w:t>Ask the approved AI tool for two low-fidelity wireframe directions. Require labelled content zones, source space and no invented data or imagery.</w:t>
       </w:r>
     </w:p>
     <w:p>
@@ -2469,10 +3154,10 @@
         <w:rPr>
           <w:b/>
         </w:rPr>
-        <w:t xml:space="preserve">Turn on layout aids — </w:t>
-      </w:r>
-      <w:r>
-        <w:t>Choose View &gt; Ruler, View &gt; Gridlines and View &gt; Guides. Add guides so the page has equal left and right margins and three clear content zones.</w:t>
+        <w:t xml:space="preserve">Score the directions — </w:t>
+      </w:r>
+      <w:r>
+        <w:t>Compare both options for question fit, hierarchy, evidence space, reading order, accessibility and ease of PowerPoint refinement.</w:t>
       </w:r>
     </w:p>
     <w:p>
@@ -2486,10 +3171,10 @@
         <w:rPr>
           <w:b/>
         </w:rPr>
-        <w:t xml:space="preserve">Sketch with placeholders — </w:t>
-      </w:r>
-      <w:r>
-        <w:t>Use Insert &gt; Shapes to create only the title, context, evidence blocks, connectors, action and source area. Use grey fills and short placeholder labels; do not style the final design yet.</w:t>
+        <w:t xml:space="preserve">Build the approved wireframe — </w:t>
+      </w:r>
+      <w:r>
+        <w:t>In PowerPoint set a portrait canvas, turn on guides and recreate only the selected direction with editable grey placeholders.</w:t>
       </w:r>
     </w:p>
     <w:p>
@@ -2520,12 +3205,44 @@
         <w:rPr>
           <w:b/>
         </w:rPr>
-        <w:t xml:space="preserve">Record the wireframe decision — </w:t>
-      </w:r>
-      <w:r>
-        <w:t>On the Notes slide capture the chosen form, removed content, intended channel and accessibility risks.</w:t>
-      </w:r>
-    </w:p>
+        <w:t xml:space="preserve">Record the decision — </w:t>
+      </w:r>
+      <w:r>
+        <w:t>Capture the chosen direction, rejected option, prompt, removed content, intended channel, accessibility risks, reviewer and owner.</w:t>
+      </w:r>
+    </w:p>
+    <w:p>
+      <w:r>
+        <w:rPr>
+          <w:b/>
+          <w:color w:val="1F6FEB"/>
+        </w:rPr>
+        <w:t>Test it</w:t>
+      </w:r>
+    </w:p>
+    <w:tbl>
+      <w:tblPr>
+        <w:tblStyle w:val="TableGrid"/>
+        <w:tblW w:type="auto" w:w="0"/>
+        <w:tblLook w:firstColumn="1" w:firstRow="1" w:lastColumn="0" w:lastRow="0" w:noHBand="0" w:noVBand="1" w:val="04A0"/>
+      </w:tblPr>
+      <w:tblGrid>
+        <w:gridCol w:w="8640"/>
+      </w:tblGrid>
+      <w:tr>
+        <w:tc>
+          <w:tcPr>
+            <w:tcW w:type="dxa" w:w="8640"/>
+            <w:shd w:val="clear" w:color="auto" w:fill="E8F7EE"/>
+          </w:tcPr>
+          <w:p>
+            <w:r>
+              <w:t>Show the wireframe at 25% zoom for five seconds. Ask a peer to identify the first, second and final reading points without coaching.</w:t>
+            </w:r>
+          </w:p>
+        </w:tc>
+      </w:tr>
+    </w:tbl>
     <w:p>
       <w:r>
         <w:rPr>
@@ -2826,7 +3543,7 @@
         <w:pStyle w:val="ListBullet"/>
       </w:pPr>
       <w:r>
-        <w:t>PowerPoint supports editable shapes, icons, SmartArt, stock images, text, native charts and Excel-linked data.</w:t>
+        <w:t>PowerPoint is the editable refinement layer for AI-generated structure, imagery, text, shapes, SmartArt, native charts and Excel-linked data.</w:t>
       </w:r>
     </w:p>
     <w:p>
@@ -2834,7 +3551,7 @@
         <w:pStyle w:val="ListBullet"/>
       </w:pPr>
       <w:r>
-        <w:t>Microsoft's infographic maker adds portrait templates and collaboration; Copilot can suggest structure, layouts and AI images.</w:t>
+        <w:t>Microsoft 365 Copilot can generate an infographic from a prompt or file; Gemini Notebook can turn selected sources into an infographic or slide deck for PowerPoint refinement.</w:t>
       </w:r>
     </w:p>
     <w:p>
@@ -2895,6 +3612,56 @@
       </w:r>
     </w:p>
     <w:p>
+      <w:pPr>
+        <w:jc w:val="center"/>
+      </w:pPr>
+      <w:r>
+        <w:drawing>
+          <wp:inline xmlns:a="http://schemas.openxmlformats.org/drawingml/2006/main" xmlns:pic="http://schemas.openxmlformats.org/drawingml/2006/picture">
+            <wp:extent cx="5623560" cy="3165261"/>
+            <wp:docPr id="4" name="Picture 4"/>
+            <wp:cNvGraphicFramePr>
+              <a:graphicFrameLocks noChangeAspect="1"/>
+            </wp:cNvGraphicFramePr>
+            <a:graphic>
+              <a:graphicData uri="http://schemas.openxmlformats.org/drawingml/2006/picture">
+                <pic:pic>
+                  <pic:nvPicPr>
+                    <pic:cNvPr id="0" name="A03.png"/>
+                    <pic:cNvPicPr/>
+                  </pic:nvPicPr>
+                  <pic:blipFill>
+                    <a:blip r:embed="rId12"/>
+                    <a:stretch>
+                      <a:fillRect/>
+                    </a:stretch>
+                  </pic:blipFill>
+                  <pic:spPr>
+                    <a:xfrm>
+                      <a:off x="0" y="0"/>
+                      <a:ext cx="5623560" cy="3165261"/>
+                    </a:xfrm>
+                    <a:prstGeom prst="rect"/>
+                  </pic:spPr>
+                </pic:pic>
+              </a:graphicData>
+            </a:graphic>
+          </wp:inline>
+        </w:drawing>
+      </w:r>
+    </w:p>
+    <w:p>
+      <w:pPr>
+        <w:jc w:val="center"/>
+      </w:pPr>
+      <w:r>
+        <w:rPr>
+          <w:i/>
+        </w:rPr>
+        <w:t>Activity 3 workflow/output preview — use the editable PPTX in the activity folder.</w:t>
+      </w:r>
+    </w:p>
+    <w:p>
       <w:r>
         <w:rPr>
           <w:b/>
@@ -2985,7 +3752,7 @@
         <w:t xml:space="preserve">Replace the message — </w:t>
       </w:r>
       <w:r>
-        <w:t>Insert the approved five-stage delivery content from A03-Template-Data.xlsx. Delete any template section that has no role in the story.</w:t>
+        <w:t>Insert the approved five-stage delivery content from A03-Build-from-Microsoft-Infographic-Maker-Data.xlsx. Delete any template section that has no role in the story.</w:t>
       </w:r>
     </w:p>
     <w:p>
@@ -3056,6 +3823,38 @@
         <w:t>Use File &gt; Export &gt; Create PDF/XPS for PDF and File &gt; Save As &gt; PNG for an image. Compare the outputs with the editable master for clipping and font changes.</w:t>
       </w:r>
     </w:p>
+    <w:p>
+      <w:r>
+        <w:rPr>
+          <w:b/>
+          <w:color w:val="1F6FEB"/>
+        </w:rPr>
+        <w:t>Test it</w:t>
+      </w:r>
+    </w:p>
+    <w:tbl>
+      <w:tblPr>
+        <w:tblStyle w:val="TableGrid"/>
+        <w:tblW w:type="auto" w:w="0"/>
+        <w:tblLook w:firstColumn="1" w:firstRow="1" w:lastColumn="0" w:lastRow="0" w:noHBand="0" w:noVBand="1" w:val="04A0"/>
+      </w:tblPr>
+      <w:tblGrid>
+        <w:gridCol w:w="8640"/>
+      </w:tblGrid>
+      <w:tr>
+        <w:tc>
+          <w:tcPr>
+            <w:tcW w:type="dxa" w:w="8640"/>
+            <w:shd w:val="clear" w:color="auto" w:fill="E8F7EE"/>
+          </w:tcPr>
+          <w:p>
+            <w:r>
+              <w:t>Move one stage group and export a fresh PDF. Confirm connectors, labels, hierarchy, source and alt-text decisions remain correct.</w:t>
+            </w:r>
+          </w:p>
+        </w:tc>
+      </w:tr>
+    </w:tbl>
     <w:p>
       <w:r>
         <w:rPr>
@@ -3326,7 +4125,7 @@
         <w:pStyle w:val="Heading2"/>
       </w:pPr>
       <w:r>
-        <w:t>Activity 4 — Create a Shape, Icon and SmartArt System</w:t>
+        <w:t>Activity 4 — Generate Visual Assets and Refine Them in PowerPoint</w:t>
       </w:r>
     </w:p>
     <w:p>
@@ -3337,7 +4136,7 @@
         <w:t xml:space="preserve">Objective: </w:t>
       </w:r>
       <w:r>
-        <w:t>Build an editable process infographic using alignment, consistent shapes, icons, type and smartart.</w:t>
+        <w:t>Use text-to-image prompting to generate a consistent asset set, then combine it with editable powerpoint labels, shapes, connectors and smartart.</w:t>
       </w:r>
     </w:p>
     <w:p>
@@ -3348,7 +4147,7 @@
         <w:t xml:space="preserve">Output: </w:t>
       </w:r>
       <w:r>
-        <w:t>A five-stage process infographic and reusable component library slide (35 minutes).</w:t>
+        <w:t>A prompt log, consistent AI-generated asset set, editable five-stage infographic and reusable PowerPoint component slide (35 minutes).</w:t>
       </w:r>
     </w:p>
     <w:p>
@@ -3362,12 +4161,62 @@
     </w:p>
     <w:p>
       <w:r>
-        <w:t>Northstar needs an editable five-stage process infographic for store managers. The current draft mixes icons, connector styles and uneven spacing.</w:t>
-      </w:r>
-    </w:p>
-    <w:p>
-      <w:r>
-        <w:t>Rebuild the process with a reusable stage component, PowerPoint alignment tools and a consistent icon/SmartArt choice.</w:t>
+        <w:t>Northstar needs an editable five-stage process infographic for store managers. Use the supplied AI-generated sustainability asset sheet or regenerate a new set from the recorded text-to-image prompt.</w:t>
+      </w:r>
+    </w:p>
+    <w:p>
+      <w:r>
+        <w:t>Use the images only as supporting visuals. Build all stage names, values, connectors, source labels and decision meaning as editable PowerPoint objects.</w:t>
+      </w:r>
+    </w:p>
+    <w:p>
+      <w:pPr>
+        <w:jc w:val="center"/>
+      </w:pPr>
+      <w:r>
+        <w:drawing>
+          <wp:inline xmlns:a="http://schemas.openxmlformats.org/drawingml/2006/main" xmlns:pic="http://schemas.openxmlformats.org/drawingml/2006/picture">
+            <wp:extent cx="5623560" cy="3165261"/>
+            <wp:docPr id="5" name="Picture 5"/>
+            <wp:cNvGraphicFramePr>
+              <a:graphicFrameLocks noChangeAspect="1"/>
+            </wp:cNvGraphicFramePr>
+            <a:graphic>
+              <a:graphicData uri="http://schemas.openxmlformats.org/drawingml/2006/picture">
+                <pic:pic>
+                  <pic:nvPicPr>
+                    <pic:cNvPr id="0" name="A04.png"/>
+                    <pic:cNvPicPr/>
+                  </pic:nvPicPr>
+                  <pic:blipFill>
+                    <a:blip r:embed="rId13"/>
+                    <a:stretch>
+                      <a:fillRect/>
+                    </a:stretch>
+                  </pic:blipFill>
+                  <pic:spPr>
+                    <a:xfrm>
+                      <a:off x="0" y="0"/>
+                      <a:ext cx="5623560" cy="3165261"/>
+                    </a:xfrm>
+                    <a:prstGeom prst="rect"/>
+                  </pic:spPr>
+                </pic:pic>
+              </a:graphicData>
+            </a:graphic>
+          </wp:inline>
+        </w:drawing>
+      </w:r>
+    </w:p>
+    <w:p>
+      <w:pPr>
+        <w:jc w:val="center"/>
+      </w:pPr>
+      <w:r>
+        <w:rPr>
+          <w:i/>
+        </w:rPr>
+        <w:t>Activity 4 workflow/output preview — use the editable PPTX in the activity folder.</w:t>
       </w:r>
     </w:p>
     <w:p>
@@ -3390,10 +4239,10 @@
         <w:rPr>
           <w:b/>
         </w:rPr>
-        <w:t xml:space="preserve">Open the start file — </w:t>
-      </w:r>
-      <w:r>
-        <w:t>Open A04-Process-System-Start.pptx and save a working copy.</w:t>
+        <w:t xml:space="preserve">Review the supplied assets — </w:t>
+      </w:r>
+      <w:r>
+        <w:t>Open the assets folder and ASSET-MANIFEST.txt. Confirm the files are synthetic training visuals, contain no factual claims and match the recorded prompt.</w:t>
       </w:r>
     </w:p>
     <w:p>
@@ -3407,10 +4256,10 @@
         <w:rPr>
           <w:b/>
         </w:rPr>
-        <w:t xml:space="preserve">Set guides and margins — </w:t>
-      </w:r>
-      <w:r>
-        <w:t>Choose View &gt; Guides. Drag guides to define equal side margins and the centre line. Keep all stages inside the safe area.</w:t>
+        <w:t xml:space="preserve">Write or adapt the image prompt — </w:t>
+      </w:r>
+      <w:r>
+        <w:t>Copy the Text-to-image prompt from PROMPTS.md. Specify the four sustainability subjects, consistent flat style, palette, transparent background, no text, no logo and no watermark.</w:t>
       </w:r>
     </w:p>
     <w:p>
@@ -3424,10 +4273,10 @@
         <w:rPr>
           <w:b/>
         </w:rPr>
-        <w:t xml:space="preserve">Build one stage component — </w:t>
-      </w:r>
-      <w:r>
-        <w:t>Insert a rounded rectangle, a numbered circle, one icon and a short label. Use Shape Format &gt; Size for consistent dimensions.</w:t>
+        <w:t xml:space="preserve">Generate an alternative set — </w:t>
+      </w:r>
+      <w:r>
+        <w:t>Use an approved text-to-image tool to create one coherent asset sheet or four separate visuals. Do not upload restricted data or copyrighted reference artwork.</w:t>
       </w:r>
     </w:p>
     <w:p>
@@ -3441,10 +4290,10 @@
         <w:rPr>
           <w:b/>
         </w:rPr>
-        <w:t xml:space="preserve">Duplicate consistently — </w:t>
-      </w:r>
-      <w:r>
-        <w:t>Select the complete stage, press Ctrl+G or Command+G to group it, then duplicate it four times. Edit labels only after the layout is stable.</w:t>
+        <w:t xml:space="preserve">Inspect before use — </w:t>
+      </w:r>
+      <w:r>
+        <w:t>Reject any result with embedded text, distorted objects, inconsistent visual grammar, ambiguous symbols or rights concerns. Record the accepted and rejected results.</w:t>
       </w:r>
     </w:p>
     <w:p>
@@ -3458,10 +4307,10 @@
         <w:rPr>
           <w:b/>
         </w:rPr>
-        <w:t xml:space="preserve">Align and distribute — </w:t>
-      </w:r>
-      <w:r>
-        <w:t>Select all stage groups and choose Shape Format &gt; Align &gt; Align Middle, then Distribute Horizontally.</w:t>
+        <w:t xml:space="preserve">Open the PowerPoint start file — </w:t>
+      </w:r>
+      <w:r>
+        <w:t>Save a named working copy, set guides and margins, and insert only the approved assets.</w:t>
       </w:r>
     </w:p>
     <w:p>
@@ -3475,10 +4324,10 @@
         <w:rPr>
           <w:b/>
         </w:rPr>
-        <w:t xml:space="preserve">Add real connectors — </w:t>
-      </w:r>
-      <w:r>
-        <w:t>Choose Insert &gt; Shapes &gt; Lines &gt; Connector. Attach connectors to the connection points of each stage so they remain linked when moved.</w:t>
+        <w:t xml:space="preserve">Build editable information — </w:t>
+      </w:r>
+      <w:r>
+        <w:t>Create the five stage containers, titles, metrics, connectors, source notes and decision labels as native PowerPoint objects. Do not bake claims into the image.</w:t>
       </w:r>
     </w:p>
     <w:p>
@@ -3492,10 +4341,10 @@
         <w:rPr>
           <w:b/>
         </w:rPr>
-        <w:t xml:space="preserve">Use one icon family — </w:t>
-      </w:r>
-      <w:r>
-        <w:t>Choose Insert &gt; Icons and search for the five concepts. Apply one outline or filled style consistently and add direct text labels.</w:t>
+        <w:t xml:space="preserve">Align and distribute — </w:t>
+      </w:r>
+      <w:r>
+        <w:t>Use Shape Format &gt; Align and Distribute. Group each stage logically while keeping text and data editable.</w:t>
       </w:r>
     </w:p>
     <w:p>
@@ -3509,10 +4358,10 @@
         <w:rPr>
           <w:b/>
         </w:rPr>
-        <w:t xml:space="preserve">Test SmartArt as an alternative — </w:t>
-      </w:r>
-      <w:r>
-        <w:t>Duplicate the slide. Choose Insert &gt; SmartArt &gt; Process and recreate the stages. Compare control, speed and editability; retain the stronger version and record why.</w:t>
+        <w:t xml:space="preserve">Add accessibility — </w:t>
+      </w:r>
+      <w:r>
+        <w:t>Write purpose-focused alt text for meaningful assets, mark decorative assets where appropriate and preserve direct text labels.</w:t>
       </w:r>
     </w:p>
     <w:p>
@@ -3526,12 +4375,44 @@
         <w:rPr>
           <w:b/>
         </w:rPr>
-        <w:t xml:space="preserve">Create the component library — </w:t>
-      </w:r>
-      <w:r>
-        <w:t>Copy one clean stage, connector, label and icon treatment to a Components slide for future reuse.</w:t>
-      </w:r>
-    </w:p>
+        <w:t xml:space="preserve">Complete provenance — </w:t>
+      </w:r>
+      <w:r>
+        <w:t>Record tool, exact prompt, date, source status, intended use, review result, human changes, reviewer and owner in the workbook and ASSET-MANIFEST.txt.</w:t>
+      </w:r>
+    </w:p>
+    <w:p>
+      <w:r>
+        <w:rPr>
+          <w:b/>
+          <w:color w:val="1F6FEB"/>
+        </w:rPr>
+        <w:t>Test it</w:t>
+      </w:r>
+    </w:p>
+    <w:tbl>
+      <w:tblPr>
+        <w:tblStyle w:val="TableGrid"/>
+        <w:tblW w:type="auto" w:w="0"/>
+        <w:tblLook w:firstColumn="1" w:firstRow="1" w:lastColumn="0" w:lastRow="0" w:noHBand="0" w:noVBand="1" w:val="04A0"/>
+      </w:tblPr>
+      <w:tblGrid>
+        <w:gridCol w:w="8640"/>
+      </w:tblGrid>
+      <w:tr>
+        <w:tc>
+          <w:tcPr>
+            <w:tcW w:type="dxa" w:w="8640"/>
+            <w:shd w:val="clear" w:color="auto" w:fill="E8F7EE"/>
+          </w:tcPr>
+          <w:p>
+            <w:r>
+              <w:t>Replace one generated asset. Confirm all facts, labels, connectors and sources remain separate, native and editable in PowerPoint.</w:t>
+            </w:r>
+          </w:p>
+        </w:tc>
+      </w:tr>
+    </w:tbl>
     <w:p>
       <w:r>
         <w:rPr>
@@ -3802,7 +4683,7 @@
         <w:pStyle w:val="Heading2"/>
       </w:pPr>
       <w:r>
-        <w:t>Activity 5 — Transform Excel Data into a Native PowerPoint Story</w:t>
+        <w:t>Activity 5 — Use AI Analysis to Build a Native PowerPoint Data Story</w:t>
       </w:r>
     </w:p>
     <w:p>
@@ -3813,7 +4694,7 @@
         <w:t xml:space="preserve">Objective: </w:t>
       </w:r>
       <w:r>
-        <w:t>Select metrics, create a native editable chart and annotate the decision insight with source context.</w:t>
+        <w:t>Use ai to clean and analyse mock excel data, verify calculations, then create a native editable chart and decision story in powerpoint.</w:t>
       </w:r>
     </w:p>
     <w:p>
@@ -3824,7 +4705,7 @@
         <w:t xml:space="preserve">Output: </w:t>
       </w:r>
       <w:r>
-        <w:t>A native editable PowerPoint chart plus an annotated decision slide (45 minutes).</w:t>
+        <w:t>An AI analysis log, verified formula workbook, native editable PowerPoint chart and annotated decision slide (45 minutes).</w:t>
       </w:r>
     </w:p>
     <w:p>
@@ -3843,7 +4724,57 @@
     </w:p>
     <w:p>
       <w:r>
-        <w:t>Create an editable PowerPoint chart that combines the right metric with an explicit decision implication. Do not paste a screenshot-only chart.</w:t>
+        <w:t>Prompt an approved AI assistant to analyse the workbook and propose candidate insights. Reproduce the selected calculations in Excel, then create an editable PowerPoint chart with an explicit decision implication.</w:t>
+      </w:r>
+    </w:p>
+    <w:p>
+      <w:pPr>
+        <w:jc w:val="center"/>
+      </w:pPr>
+      <w:r>
+        <w:drawing>
+          <wp:inline xmlns:a="http://schemas.openxmlformats.org/drawingml/2006/main" xmlns:pic="http://schemas.openxmlformats.org/drawingml/2006/picture">
+            <wp:extent cx="5623560" cy="3165261"/>
+            <wp:docPr id="6" name="Picture 6"/>
+            <wp:cNvGraphicFramePr>
+              <a:graphicFrameLocks noChangeAspect="1"/>
+            </wp:cNvGraphicFramePr>
+            <a:graphic>
+              <a:graphicData uri="http://schemas.openxmlformats.org/drawingml/2006/picture">
+                <pic:pic>
+                  <pic:nvPicPr>
+                    <pic:cNvPr id="0" name="A05.png"/>
+                    <pic:cNvPicPr/>
+                  </pic:nvPicPr>
+                  <pic:blipFill>
+                    <a:blip r:embed="rId14"/>
+                    <a:stretch>
+                      <a:fillRect/>
+                    </a:stretch>
+                  </pic:blipFill>
+                  <pic:spPr>
+                    <a:xfrm>
+                      <a:off x="0" y="0"/>
+                      <a:ext cx="5623560" cy="3165261"/>
+                    </a:xfrm>
+                    <a:prstGeom prst="rect"/>
+                  </pic:spPr>
+                </pic:pic>
+              </a:graphicData>
+            </a:graphic>
+          </wp:inline>
+        </w:drawing>
+      </w:r>
+    </w:p>
+    <w:p>
+      <w:pPr>
+        <w:jc w:val="center"/>
+      </w:pPr>
+      <w:r>
+        <w:rPr>
+          <w:i/>
+        </w:rPr>
+        <w:t>Activity 5 workflow/output preview — use the editable PPTX in the activity folder.</w:t>
       </w:r>
     </w:p>
     <w:p>
@@ -3869,7 +4800,7 @@
         <w:t xml:space="preserve">Open and validate the workbook — </w:t>
       </w:r>
       <w:r>
-        <w:t>Open A05-Product-Promotion-Data.xlsx. Review Raw Data, Analysis and Source Notes. Change one input value and confirm formulas update without errors.</w:t>
+        <w:t>Open the A05 XLSX. Review Data, Analysis, Source Notes and AI Prompt Lab. Change one input value and confirm formulas update without errors.</w:t>
       </w:r>
     </w:p>
     <w:p>
@@ -3883,10 +4814,10 @@
         <w:rPr>
           <w:b/>
         </w:rPr>
-        <w:t xml:space="preserve">Define the decision metric — </w:t>
-      </w:r>
-      <w:r>
-        <w:t>On Analysis compare revenue, growth, margin and returns. In the yellow Decision question cell state which product family to promote and the minimum evidence required.</w:t>
+        <w:t xml:space="preserve">Run the analysis prompt — </w:t>
+      </w:r>
+      <w:r>
+        <w:t>Ask an approved AI assistant to flag data-quality issues, compare revenue, growth, margin and returns, calculate candidate metrics and provide citations to the relevant rows. Require no invented values.</w:t>
       </w:r>
     </w:p>
     <w:p>
@@ -3900,10 +4831,10 @@
         <w:rPr>
           <w:b/>
         </w:rPr>
-        <w:t xml:space="preserve">Choose the chart — </w:t>
-      </w:r>
-      <w:r>
-        <w:t>Use a clustered bar for category comparison or a line for change over time. Explain why the chosen chart reveals the relationship better than a pie or 3-D chart.</w:t>
+        <w:t xml:space="preserve">Verify every calculation — </w:t>
+      </w:r>
+      <w:r>
+        <w:t>Reproduce the selected growth, totals, averages and comparisons with Excel formulas. Record any rejected AI claim and why.</w:t>
       </w:r>
     </w:p>
     <w:p>
@@ -3917,10 +4848,10 @@
         <w:rPr>
           <w:b/>
         </w:rPr>
-        <w:t xml:space="preserve">Create the Excel chart — </w:t>
-      </w:r>
-      <w:r>
-        <w:t>Select the prepared Analysis range, choose Insert &gt; Recommended Charts, select the intended chart, and add a precise chart title.</w:t>
+        <w:t xml:space="preserve">Define the decision metric — </w:t>
+      </w:r>
+      <w:r>
+        <w:t>State which product family to promote and the minimum evidence required. Separate observed patterns from hypotheses and caveats.</w:t>
       </w:r>
     </w:p>
     <w:p>
@@ -3934,10 +4865,10 @@
         <w:rPr>
           <w:b/>
         </w:rPr>
-        <w:t xml:space="preserve">Paste as a native chart — </w:t>
-      </w:r>
-      <w:r>
-        <w:t>Copy the chart. In PowerPoint choose Home &gt; Paste &gt; Use Destination Theme &amp; Embed Workbook or Keep Source Formatting &amp; Link Data. Do not paste as a picture.</w:t>
+        <w:t xml:space="preserve">Choose the chart — </w:t>
+      </w:r>
+      <w:r>
+        <w:t>Use a clustered bar for category comparison or a line for change over time. Explain why the chart reveals the relationship better than a pie or 3-D chart.</w:t>
       </w:r>
     </w:p>
     <w:p>
@@ -3951,10 +4882,10 @@
         <w:rPr>
           <w:b/>
         </w:rPr>
-        <w:t xml:space="preserve">Remove chart junk — </w:t>
-      </w:r>
-      <w:r>
-        <w:t>Use Chart Design &gt; Add Chart Element. Keep only necessary axes, direct labels and a short title. Remove background fills, 3-D effects, unnecessary gridlines and legends.</w:t>
+        <w:t xml:space="preserve">Create the Excel chart — </w:t>
+      </w:r>
+      <w:r>
+        <w:t>Select the prepared Analysis range, choose Insert &gt; Recommended Charts, select the intended chart, and add a precise chart title.</w:t>
       </w:r>
     </w:p>
     <w:p>
@@ -3968,10 +4899,10 @@
         <w:rPr>
           <w:b/>
         </w:rPr>
-        <w:t xml:space="preserve">Write the action title — </w:t>
-      </w:r>
-      <w:r>
-        <w:t>Replace the topic title with a sentence that states the supported conclusion, for example Ready Meals combine the fastest Q2 growth with above-floor margin.</w:t>
+        <w:t xml:space="preserve">Paste as a native chart — </w:t>
+      </w:r>
+      <w:r>
+        <w:t>Copy the chart. In PowerPoint choose Home &gt; Paste &gt; Use Destination Theme &amp; Embed Workbook or Keep Source Formatting &amp; Link Data. Do not paste as a picture.</w:t>
       </w:r>
     </w:p>
     <w:p>
@@ -3985,10 +4916,10 @@
         <w:rPr>
           <w:b/>
         </w:rPr>
-        <w:t xml:space="preserve">Highlight the decision — </w:t>
-      </w:r>
-      <w:r>
-        <w:t>Use one accent colour for the selected category. Keep all comparison categories neutral and add one concise annotation.</w:t>
+        <w:t xml:space="preserve">Remove chart junk — </w:t>
+      </w:r>
+      <w:r>
+        <w:t>Use Chart Design &gt; Add Chart Element. Keep only necessary axes, direct labels and a short title. Remove background fills, 3-D effects, unnecessary gridlines and legends.</w:t>
       </w:r>
     </w:p>
     <w:p>
@@ -4002,10 +4933,10 @@
         <w:rPr>
           <w:b/>
         </w:rPr>
-        <w:t xml:space="preserve">Add source and limitation — </w:t>
-      </w:r>
-      <w:r>
-        <w:t>Show Synthetic Northstar data, Jan-Jun 2026 and one relevant caveat such as promotional seasonality or return-rate uncertainty.</w:t>
+        <w:t xml:space="preserve">Write the action title — </w:t>
+      </w:r>
+      <w:r>
+        <w:t>Replace the topic title with a sentence that states the supported conclusion, for example Ready Meals combine the fastest Q2 growth with above-floor margin.</w:t>
       </w:r>
     </w:p>
     <w:p>
@@ -4019,12 +4950,78 @@
         <w:rPr>
           <w:b/>
         </w:rPr>
-        <w:t xml:space="preserve">Test refresh — </w:t>
-      </w:r>
-      <w:r>
-        <w:t>Change one workbook input, save it, refresh or repaste the chart as appropriate, and confirm the PowerPoint visual updates correctly.</w:t>
-      </w:r>
-    </w:p>
+        <w:t xml:space="preserve">Highlight the decision — </w:t>
+      </w:r>
+      <w:r>
+        <w:t>Use one accent colour for the selected category. Keep all comparison categories neutral and add one concise annotation.</w:t>
+      </w:r>
+    </w:p>
+    <w:p>
+      <w:pPr>
+        <w:numPr>
+          <w:ilvl w:val="0"/>
+          <w:numId w:val="14"/>
+        </w:numPr>
+      </w:pPr>
+      <w:r>
+        <w:rPr>
+          <w:b/>
+        </w:rPr>
+        <w:t xml:space="preserve">Add source and limitation — </w:t>
+      </w:r>
+      <w:r>
+        <w:t>Show Synthetic Northstar data, Jan-Jun 2026 and one relevant caveat such as promotional seasonality or return-rate uncertainty.</w:t>
+      </w:r>
+    </w:p>
+    <w:p>
+      <w:pPr>
+        <w:numPr>
+          <w:ilvl w:val="0"/>
+          <w:numId w:val="14"/>
+        </w:numPr>
+      </w:pPr>
+      <w:r>
+        <w:rPr>
+          <w:b/>
+        </w:rPr>
+        <w:t xml:space="preserve">Test refresh and log — </w:t>
+      </w:r>
+      <w:r>
+        <w:t>Change one workbook input, refresh the chart and confirm the visual updates. Complete the AI prompt/source log with tool, prompt, output, verification and owner.</w:t>
+      </w:r>
+    </w:p>
+    <w:p>
+      <w:r>
+        <w:rPr>
+          <w:b/>
+          <w:color w:val="1F6FEB"/>
+        </w:rPr>
+        <w:t>Test it</w:t>
+      </w:r>
+    </w:p>
+    <w:tbl>
+      <w:tblPr>
+        <w:tblStyle w:val="TableGrid"/>
+        <w:tblW w:type="auto" w:w="0"/>
+        <w:tblLook w:firstColumn="1" w:firstRow="1" w:lastColumn="0" w:lastRow="0" w:noHBand="0" w:noVBand="1" w:val="04A0"/>
+      </w:tblPr>
+      <w:tblGrid>
+        <w:gridCol w:w="8640"/>
+      </w:tblGrid>
+      <w:tr>
+        <w:tc>
+          <w:tcPr>
+            <w:tcW w:type="dxa" w:w="8640"/>
+            <w:shd w:val="clear" w:color="auto" w:fill="E8F7EE"/>
+          </w:tcPr>
+          <w:p>
+            <w:r>
+              <w:t>Change one Excel input, refresh the native chart and verify the action title, direct labels, unit and limitation against the updated data.</w:t>
+            </w:r>
+          </w:p>
+        </w:tc>
+      </w:tr>
+    </w:tbl>
     <w:p>
       <w:r>
         <w:rPr>
@@ -4295,7 +5292,7 @@
         <w:pStyle w:val="Heading2"/>
       </w:pPr>
       <w:r>
-        <w:t>Activity 6 — Generate and Refine an AI-Assisted Infographic</w:t>
+        <w:t>Activity 6 — Compare Microsoft 365 Copilot and Gemini Notebook</w:t>
       </w:r>
     </w:p>
     <w:p>
@@ -4306,7 +5303,7 @@
         <w:t xml:space="preserve">Objective: </w:t>
       </w:r>
       <w:r>
-        <w:t>Use copilot or ai designer to generate options and apply a human review gate before release.</w:t>
+        <w:t>Generate the same source-grounded infographic brief in microsoft 365 copilot and gemini notebook, bring the gemini notebook deck into powerpoint through pptx download or a documented pdf rebuild route, and compare both routes before refinement.</w:t>
       </w:r>
     </w:p>
     <w:p>
@@ -4317,7 +5314,7 @@
         <w:t xml:space="preserve">Output: </w:t>
       </w:r>
       <w:r>
-        <w:t>Two AI layout options, one reviewed final infographic and a prompt/source log (45 minutes).</w:t>
+        <w:t>A Microsoft output, Gemini Notebook infographic and downloaded PPTX or PDF, comparison scorecard, reviewed final PowerPoint and prompt/source log (45 minutes).</w:t>
       </w:r>
     </w:p>
     <w:p>
@@ -4331,12 +5328,62 @@
     </w:p>
     <w:p>
       <w:r>
-        <w:t>Northstar wants an executive one-slide infographic summarising the sustainable-delivery pilot. Copilot or AI Designer may generate a layout, section titles and supporting image ideas from the approved source pack.</w:t>
-      </w:r>
-    </w:p>
-    <w:p>
-      <w:r>
-        <w:t>Generate two options, compare them, then rebuild the selected direction into an editable, verified and accessible PowerPoint slide.</w:t>
+        <w:t>Northstar wants an executive infographic and short slide narrative summarising the sustainable-delivery pilot from a spreadsheet, policy note and stakeholder feedback summary.</w:t>
+      </w:r>
+    </w:p>
+    <w:p>
+      <w:r>
+        <w:t>Run the same verified brief through Microsoft 365 Copilot and Gemini Notebook. Generate a Gemini Notebook Infographic plus Presenter Slides, preserve the deck as PPTX where available or PDF with a documented rebuild route, compare both routes and refine the selected master in PowerPoint.</w:t>
+      </w:r>
+    </w:p>
+    <w:p>
+      <w:pPr>
+        <w:jc w:val="center"/>
+      </w:pPr>
+      <w:r>
+        <w:drawing>
+          <wp:inline xmlns:a="http://schemas.openxmlformats.org/drawingml/2006/main" xmlns:pic="http://schemas.openxmlformats.org/drawingml/2006/picture">
+            <wp:extent cx="5623560" cy="3165261"/>
+            <wp:docPr id="7" name="Picture 7"/>
+            <wp:cNvGraphicFramePr>
+              <a:graphicFrameLocks noChangeAspect="1"/>
+            </wp:cNvGraphicFramePr>
+            <a:graphic>
+              <a:graphicData uri="http://schemas.openxmlformats.org/drawingml/2006/picture">
+                <pic:pic>
+                  <pic:nvPicPr>
+                    <pic:cNvPr id="0" name="A06.png"/>
+                    <pic:cNvPicPr/>
+                  </pic:nvPicPr>
+                  <pic:blipFill>
+                    <a:blip r:embed="rId15"/>
+                    <a:stretch>
+                      <a:fillRect/>
+                    </a:stretch>
+                  </pic:blipFill>
+                  <pic:spPr>
+                    <a:xfrm>
+                      <a:off x="0" y="0"/>
+                      <a:ext cx="5623560" cy="3165261"/>
+                    </a:xfrm>
+                    <a:prstGeom prst="rect"/>
+                  </pic:spPr>
+                </pic:pic>
+              </a:graphicData>
+            </a:graphic>
+          </wp:inline>
+        </w:drawing>
+      </w:r>
+    </w:p>
+    <w:p>
+      <w:pPr>
+        <w:jc w:val="center"/>
+      </w:pPr>
+      <w:r>
+        <w:rPr>
+          <w:i/>
+        </w:rPr>
+        <w:t>Activity 6 workflow/output preview — use the editable PPTX in the activity folder.</w:t>
       </w:r>
     </w:p>
     <w:p>
@@ -4359,10 +5406,10 @@
         <w:rPr>
           <w:b/>
         </w:rPr>
-        <w:t xml:space="preserve">Open the prompt brief — </w:t>
-      </w:r>
-      <w:r>
-        <w:t>Open A06-AI-Infographic-Prompt-and-Log.xlsx. Complete Audience, objective, approved source data, infographic type, brand rules, accessibility rules and forbidden claims.</w:t>
+        <w:t xml:space="preserve">Open the common brief — </w:t>
+      </w:r>
+      <w:r>
+        <w:t>Open the A06 workbook, PROMPTS.md and source-pack folder. Complete the audience, objective, approved sources, verified claims, forbidden claims, infographic form, brand and accessibility rules.</w:t>
       </w:r>
     </w:p>
     <w:p>
@@ -4376,10 +5423,10 @@
         <w:rPr>
           <w:b/>
         </w:rPr>
-        <w:t xml:space="preserve">Start Copilot or AI Designer — </w:t>
-      </w:r>
-      <w:r>
-        <w:t>In PowerPoint select the Copilot button or open the Microsoft AI presentation designer page. Use only an approved account and approved synthetic data.</w:t>
+        <w:t xml:space="preserve">Run the Microsoft route — </w:t>
+      </w:r>
+      <w:r>
+        <w:t>In the Microsoft 365 Copilot app choose Create &gt; Design an infographic, or use Copilot in PowerPoint. Add the approved file where available, submit the common prompt and save the generated option.</w:t>
       </w:r>
     </w:p>
     <w:p>
@@ -4393,10 +5440,10 @@
         <w:rPr>
           <w:b/>
         </w:rPr>
-        <w:t xml:space="preserve">Submit a structured prompt — </w:t>
-      </w:r>
-      <w:r>
-        <w:t>Ask for a single-slide executive infographic with two layout options. Require no invented data, explicit source space, editable content, restrained brand colours and a clear recommendation.</w:t>
+        <w:t xml:space="preserve">Run the Gemini Notebook route — </w:t>
+      </w:r>
+      <w:r>
+        <w:t>Create a notebook, add only the approved source-pack files and select them. In Studio customise and generate an Infographic using the same audience, focus, style, orientation and evidence constraints.</w:t>
       </w:r>
     </w:p>
     <w:p>
@@ -4410,10 +5457,10 @@
         <w:rPr>
           <w:b/>
         </w:rPr>
-        <w:t xml:space="preserve">Capture both options — </w:t>
-      </w:r>
-      <w:r>
-        <w:t>Save screenshots or duplicate the generated slides. Label them Option A and Option B; do not overwrite the original output.</w:t>
+        <w:t xml:space="preserve">Generate Gemini Notebook slides — </w:t>
+      </w:r>
+      <w:r>
+        <w:t>In Studio select Slide Deck, choose Presenter Slides, set the language and length and reuse the common prompt. Generate and inspect the deck. Use the three-dot menu to Download PowerPoint (.pptx) when that option is available. If the interface exposes only PDF, download the PDF, keep it as evidence and rebuild decision-critical content as native PowerPoint objects rather than assuming the PDF is fully editable.</w:t>
       </w:r>
     </w:p>
     <w:p>
@@ -4427,10 +5474,10 @@
         <w:rPr>
           <w:b/>
         </w:rPr>
-        <w:t xml:space="preserve">Score the options — </w:t>
-      </w:r>
-      <w:r>
-        <w:t>Use the Review sheet to score message accuracy, hierarchy, data integrity, editability, brand, accessibility and output fit.</w:t>
+        <w:t xml:space="preserve">Preserve originals — </w:t>
+      </w:r>
+      <w:r>
+        <w:t>Keep the Microsoft output, Gemini Notebook infographic PNG and downloaded Gemini Notebook PPTX or PDF unchanged as evidence. Work only on named copies.</w:t>
       </w:r>
     </w:p>
     <w:p>
@@ -4444,10 +5491,10 @@
         <w:rPr>
           <w:b/>
         </w:rPr>
-        <w:t xml:space="preserve">Verify every claim — </w:t>
-      </w:r>
-      <w:r>
-        <w:t>Compare every number, label and relationship with A06-Pilot-Summary-Data.xlsx. Delete or correct anything not supported.</w:t>
+        <w:t xml:space="preserve">Compare the routes — </w:t>
+      </w:r>
+      <w:r>
+        <w:t>Use the Comparison sheet to score source grounding, factual accuracy, citations, hierarchy, visual quality, editability, brand, accessibility, speed and privacy fit.</w:t>
       </w:r>
     </w:p>
     <w:p>
@@ -4461,10 +5508,10 @@
         <w:rPr>
           <w:b/>
         </w:rPr>
-        <w:t xml:space="preserve">Rebuild critical evidence — </w:t>
-      </w:r>
-      <w:r>
-        <w:t>Create native PowerPoint text, shapes and charts for all decision-critical content. Replace any flattened chart or unreadable generated text.</w:t>
+        <w:t xml:space="preserve">Verify every claim — </w:t>
+      </w:r>
+      <w:r>
+        <w:t>Compare every number, label and relationship with the workbook and source pack. Note that AI-generated infographics and decks may contain factual or visual inaccuracies.</w:t>
       </w:r>
     </w:p>
     <w:p>
@@ -4478,10 +5525,10 @@
         <w:rPr>
           <w:b/>
         </w:rPr>
-        <w:t xml:space="preserve">Check imagery and rights — </w:t>
-      </w:r>
-      <w:r>
-        <w:t>For AI images record the prompt, intended use and review result. Do not treat a generated conceptual image as measured evidence.</w:t>
+        <w:t xml:space="preserve">Refine in PowerPoint — </w:t>
+      </w:r>
+      <w:r>
+        <w:t>Choose the stronger direction. Rebuild decision-critical numbers, text, labels and charts as native objects; apply brand, source footer, alt text and correct reading order.</w:t>
       </w:r>
     </w:p>
     <w:p>
@@ -4495,29 +5542,44 @@
         <w:rPr>
           <w:b/>
         </w:rPr>
-        <w:t xml:space="preserve">Run accessibility review — </w:t>
-      </w:r>
-      <w:r>
-        <w:t>Use Review &gt; Check Accessibility. Fix reading order, contrast, missing alt text and reliance on colour alone.</w:t>
-      </w:r>
-    </w:p>
-    <w:p>
-      <w:pPr>
-        <w:numPr>
-          <w:ilvl w:val="0"/>
-          <w:numId w:val="15"/>
-        </w:numPr>
-      </w:pPr>
+        <w:t xml:space="preserve">Record ownership — </w:t>
+      </w:r>
+      <w:r>
+        <w:t>Complete the prompt/source log with both tools, selected sources, prompts, outputs, rejected claims, human changes, reviewer and final owner.</w:t>
+      </w:r>
+    </w:p>
+    <w:p>
       <w:r>
         <w:rPr>
           <w:b/>
+          <w:color w:val="1F6FEB"/>
         </w:rPr>
-        <w:t xml:space="preserve">Record ownership — </w:t>
-      </w:r>
-      <w:r>
-        <w:t>Complete the prompt/source log with tool, date, approved inputs, human changes, reviewer and final owner.</w:t>
-      </w:r>
-    </w:p>
+        <w:t>Test it</w:t>
+      </w:r>
+    </w:p>
+    <w:tbl>
+      <w:tblPr>
+        <w:tblStyle w:val="TableGrid"/>
+        <w:tblW w:type="auto" w:w="0"/>
+        <w:tblLook w:firstColumn="1" w:firstRow="1" w:lastColumn="0" w:lastRow="0" w:noHBand="0" w:noVBand="1" w:val="04A0"/>
+      </w:tblPr>
+      <w:tblGrid>
+        <w:gridCol w:w="8640"/>
+      </w:tblGrid>
+      <w:tr>
+        <w:tc>
+          <w:tcPr>
+            <w:tcW w:type="dxa" w:w="8640"/>
+            <w:shd w:val="clear" w:color="auto" w:fill="E8F7EE"/>
+          </w:tcPr>
+          <w:p>
+            <w:r>
+              <w:t>Select one claim produced by both AI routes. Trace it to the same approved source and document any difference in wording, hierarchy or editability.</w:t>
+            </w:r>
+          </w:p>
+        </w:tc>
+      </w:tr>
+    </w:tbl>
     <w:p>
       <w:r>
         <w:rPr>
@@ -4696,7 +5758,7 @@
         <w:pStyle w:val="ListBullet"/>
       </w:pPr>
       <w:r>
-        <w:t>Prompt names audience, objective, data and constraints</w:t>
+        <w:t>Both tools used the same approved brief and source scope</w:t>
       </w:r>
     </w:p>
     <w:p>
@@ -4704,7 +5766,7 @@
         <w:pStyle w:val="ListBullet"/>
       </w:pPr>
       <w:r>
-        <w:t>Every claim matches the source workbook</w:t>
+        <w:t>Gemini Notebook deck was preserved as PPTX where available or PDF with a documented rebuild route</w:t>
       </w:r>
     </w:p>
     <w:p>
@@ -4712,7 +5774,7 @@
         <w:pStyle w:val="ListBullet"/>
       </w:pPr>
       <w:r>
-        <w:t>Critical evidence is editable</w:t>
+        <w:t>Every claim matches the source pack</w:t>
       </w:r>
     </w:p>
     <w:p>
@@ -4720,7 +5782,7 @@
         <w:pStyle w:val="ListBullet"/>
       </w:pPr>
       <w:r>
-        <w:t>Privacy, rights, brand and accessibility are checked</w:t>
+        <w:t>Critical evidence is editable in the final PowerPoint</w:t>
       </w:r>
     </w:p>
     <w:p>
@@ -4728,7 +5790,7 @@
         <w:pStyle w:val="ListBullet"/>
       </w:pPr>
       <w:r>
-        <w:t>Prompt, human changes, reviewer and owner are recorded</w:t>
+        <w:t>Both prompts, human changes, reviewer and owner are recorded</w:t>
       </w:r>
     </w:p>
     <w:p>
@@ -4887,6 +5949,56 @@
       </w:r>
     </w:p>
     <w:p>
+      <w:pPr>
+        <w:jc w:val="center"/>
+      </w:pPr>
+      <w:r>
+        <w:drawing>
+          <wp:inline xmlns:a="http://schemas.openxmlformats.org/drawingml/2006/main" xmlns:pic="http://schemas.openxmlformats.org/drawingml/2006/picture">
+            <wp:extent cx="5623560" cy="3165261"/>
+            <wp:docPr id="8" name="Picture 8"/>
+            <wp:cNvGraphicFramePr>
+              <a:graphicFrameLocks noChangeAspect="1"/>
+            </wp:cNvGraphicFramePr>
+            <a:graphic>
+              <a:graphicData uri="http://schemas.openxmlformats.org/drawingml/2006/picture">
+                <pic:pic>
+                  <pic:nvPicPr>
+                    <pic:cNvPr id="0" name="A07.png"/>
+                    <pic:cNvPicPr/>
+                  </pic:nvPicPr>
+                  <pic:blipFill>
+                    <a:blip r:embed="rId16"/>
+                    <a:stretch>
+                      <a:fillRect/>
+                    </a:stretch>
+                  </pic:blipFill>
+                  <pic:spPr>
+                    <a:xfrm>
+                      <a:off x="0" y="0"/>
+                      <a:ext cx="5623560" cy="3165261"/>
+                    </a:xfrm>
+                    <a:prstGeom prst="rect"/>
+                  </pic:spPr>
+                </pic:pic>
+              </a:graphicData>
+            </a:graphic>
+          </wp:inline>
+        </w:drawing>
+      </w:r>
+    </w:p>
+    <w:p>
+      <w:pPr>
+        <w:jc w:val="center"/>
+      </w:pPr>
+      <w:r>
+        <w:rPr>
+          <w:i/>
+        </w:rPr>
+        <w:t>Activity 7 workflow/output preview — use the editable PPTX in the activity folder.</w:t>
+      </w:r>
+    </w:p>
+    <w:p>
       <w:r>
         <w:rPr>
           <w:b/>
@@ -4993,7 +6105,7 @@
         <w:t xml:space="preserve">Record observations — </w:t>
       </w:r>
       <w:r>
-        <w:t>In A07-Peer-Review-Log.xlsx capture visible facts only: reading order, text size, labels, contrast, source, chart comprehension and action clarity.</w:t>
+        <w:t>In A07-Peer-Coaching-and-Story-Review-Data.xlsx capture visible facts only: reading order, text size, labels, contrast, source, chart comprehension and action clarity.</w:t>
       </w:r>
     </w:p>
     <w:p>
@@ -5081,6 +6193,38 @@
         <w:t>Repeat the five-second test and write 150-250 words on what improved, what remains and why.</w:t>
       </w:r>
     </w:p>
+    <w:p>
+      <w:r>
+        <w:rPr>
+          <w:b/>
+          <w:color w:val="1F6FEB"/>
+        </w:rPr>
+        <w:t>Test it</w:t>
+      </w:r>
+    </w:p>
+    <w:tbl>
+      <w:tblPr>
+        <w:tblStyle w:val="TableGrid"/>
+        <w:tblW w:type="auto" w:w="0"/>
+        <w:tblLook w:firstColumn="1" w:firstRow="1" w:lastColumn="0" w:lastRow="0" w:noHBand="0" w:noVBand="1" w:val="04A0"/>
+      </w:tblPr>
+      <w:tblGrid>
+        <w:gridCol w:w="8640"/>
+      </w:tblGrid>
+      <w:tr>
+        <w:tc>
+          <w:tcPr>
+            <w:tcW w:type="dxa" w:w="8640"/>
+            <w:shd w:val="clear" w:color="auto" w:fill="E8F7EE"/>
+          </w:tcPr>
+          <w:p>
+            <w:r>
+              <w:t>Repeat the five-second audience test before and after revision. Record the observed change in recall, reading order or action clarity.</w:t>
+            </w:r>
+          </w:p>
+        </w:tc>
+      </w:tr>
+    </w:tbl>
     <w:p>
       <w:r>
         <w:rPr>
@@ -5387,12 +6531,62 @@
     </w:p>
     <w:p>
       <w:r>
-        <w:t>Northstar can fund one standard workflow for 12 staff. Options include PowerPoint templates only, PowerPoint with Copilot, or a mixed workflow using external design tools plus PowerPoint for final production.</w:t>
+        <w:t>Northstar can fund one standard workflow for 12 staff. Options include PowerPoint templates only, PowerPoint with Copilot, Gemini Notebook with PowerPoint, or a mixed AI workflow with PowerPoint as the controlled final-production layer.</w:t>
       </w:r>
     </w:p>
     <w:p>
       <w:r>
         <w:t>Use the supplied budget workbook and effectiveness evidence to recommend a 12-month tool, training and governance plan aligned with business outcomes.</w:t>
+      </w:r>
+    </w:p>
+    <w:p>
+      <w:pPr>
+        <w:jc w:val="center"/>
+      </w:pPr>
+      <w:r>
+        <w:drawing>
+          <wp:inline xmlns:a="http://schemas.openxmlformats.org/drawingml/2006/main" xmlns:pic="http://schemas.openxmlformats.org/drawingml/2006/picture">
+            <wp:extent cx="5623560" cy="3165261"/>
+            <wp:docPr id="9" name="Picture 9"/>
+            <wp:cNvGraphicFramePr>
+              <a:graphicFrameLocks noChangeAspect="1"/>
+            </wp:cNvGraphicFramePr>
+            <a:graphic>
+              <a:graphicData uri="http://schemas.openxmlformats.org/drawingml/2006/picture">
+                <pic:pic>
+                  <pic:nvPicPr>
+                    <pic:cNvPr id="0" name="A08.png"/>
+                    <pic:cNvPicPr/>
+                  </pic:nvPicPr>
+                  <pic:blipFill>
+                    <a:blip r:embed="rId17"/>
+                    <a:stretch>
+                      <a:fillRect/>
+                    </a:stretch>
+                  </pic:blipFill>
+                  <pic:spPr>
+                    <a:xfrm>
+                      <a:off x="0" y="0"/>
+                      <a:ext cx="5623560" cy="3165261"/>
+                    </a:xfrm>
+                    <a:prstGeom prst="rect"/>
+                  </pic:spPr>
+                </pic:pic>
+              </a:graphicData>
+            </a:graphic>
+          </wp:inline>
+        </w:drawing>
+      </w:r>
+    </w:p>
+    <w:p>
+      <w:pPr>
+        <w:jc w:val="center"/>
+      </w:pPr>
+      <w:r>
+        <w:rPr>
+          <w:i/>
+        </w:rPr>
+        <w:t>Activity 8 workflow/output preview — use the editable PPTX in the activity folder.</w:t>
       </w:r>
     </w:p>
     <w:p>
@@ -5418,7 +6612,7 @@
         <w:t xml:space="preserve">Open the options workbook — </w:t>
       </w:r>
       <w:r>
-        <w:t>Open A08-Tool-Investment-Scorecard.xlsx and review Assumptions, Options, Scorecard and Recommendation.</w:t>
+        <w:t>Open A08-Budget-and-Effectiveness-Decision-Data.xlsx and review Assumptions, Options, Scorecard and Recommendation.</w:t>
       </w:r>
     </w:p>
     <w:p>
@@ -5486,7 +6680,7 @@
         <w:t xml:space="preserve">Score each workflow — </w:t>
       </w:r>
       <w:r>
-        <w:t>Score PowerPoint templates, PowerPoint + Copilot and Mixed external tools + PowerPoint using the same scale and evidence.</w:t>
+        <w:t>Score PowerPoint templates, PowerPoint + Copilot, Gemini Notebook + PowerPoint and Mixed AI tools + PowerPoint using the same scale and evidence.</w:t>
       </w:r>
     </w:p>
     <w:p>
@@ -5554,7 +6748,7 @@
         <w:t xml:space="preserve">Create the decision slide — </w:t>
       </w:r>
       <w:r>
-        <w:t>Open A08-Investment-Decision-Start.pptx and add a native comparison chart, key trade-offs and one explicit recommendation.</w:t>
+        <w:t>Open A08-Budget-and-Effectiveness-Decision-Start.pptx and add a native comparison chart, key trade-offs and one explicit recommendation.</w:t>
       </w:r>
     </w:p>
     <w:p>
@@ -5574,6 +6768,38 @@
         <w:t>Ask which evidence could reverse the choice. Record the trigger and the date for the formal review.</w:t>
       </w:r>
     </w:p>
+    <w:p>
+      <w:r>
+        <w:rPr>
+          <w:b/>
+          <w:color w:val="1F6FEB"/>
+        </w:rPr>
+        <w:t>Test it</w:t>
+      </w:r>
+    </w:p>
+    <w:tbl>
+      <w:tblPr>
+        <w:tblStyle w:val="TableGrid"/>
+        <w:tblW w:type="auto" w:w="0"/>
+        <w:tblLook w:firstColumn="1" w:firstRow="1" w:lastColumn="0" w:lastRow="0" w:noHBand="0" w:noVBand="1" w:val="04A0"/>
+      </w:tblPr>
+      <w:tblGrid>
+        <w:gridCol w:w="8640"/>
+      </w:tblGrid>
+      <w:tr>
+        <w:tc>
+          <w:tcPr>
+            <w:tcW w:type="dxa" w:w="8640"/>
+            <w:shd w:val="clear" w:color="auto" w:fill="E8F7EE"/>
+          </w:tcPr>
+          <w:p>
+            <w:r>
+              <w:t>Change one decision weight or hard-gate result. Confirm eligibility, weighted score, 12-month cost and recommendation respond as intended.</w:t>
+            </w:r>
+          </w:p>
+        </w:tc>
+      </w:tr>
+    </w:tbl>
     <w:p>
       <w:r>
         <w:rPr>
@@ -6226,7 +7452,7 @@
         <w:pStyle w:val="ListBullet"/>
       </w:pPr>
       <w:r>
-        <w:t>Microsoft PowerPoint Infographic Maker: https://powerpoint.cloud.microsoft/create/en/infographic-maker/</w:t>
+        <w:t>Microsoft Support: Create an infographic with Microsoft 365 Copilot: https://support.microsoft.com/en-US/Microsoft-365-Copilot/create-an-infographic-with-the-microsoft-365-copilot-app</w:t>
       </w:r>
     </w:p>
     <w:p>
@@ -6234,7 +7460,7 @@
         <w:pStyle w:val="ListBullet"/>
       </w:pPr>
       <w:r>
-        <w:t>Microsoft AI Presentation Designer: https://powerpoint.cloud.microsoft/create/en/ai-presentation-designer/</w:t>
+        <w:t>Microsoft Support: Edit with Copilot in PowerPoint: https://support.microsoft.com/en-US/PowerPoint/edit-with-copilot-in-powerpoint</w:t>
       </w:r>
     </w:p>
     <w:p>
@@ -6242,6 +7468,46 @@
         <w:pStyle w:val="ListBullet"/>
       </w:pPr>
       <w:r>
+        <w:t>Google Gemini Notebook Help: Generate an Infographic: https://support.google.com/notebooklm/answer/16758265?hl=en</w:t>
+      </w:r>
+    </w:p>
+    <w:p>
+      <w:pPr>
+        <w:pStyle w:val="ListBullet"/>
+      </w:pPr>
+      <w:r>
+        <w:t>Google Gemini Notebook Help: Generate a Slide Deck: https://support.google.com/notebooklm/answer/16757456?hl=en</w:t>
+      </w:r>
+    </w:p>
+    <w:p>
+      <w:pPr>
+        <w:pStyle w:val="ListBullet"/>
+      </w:pPr>
+      <w:r>
+        <w:t>Analytics Vidhya: Infographics and PPTs with NotebookLM (now Gemini Notebook): https://www.analyticsvidhya.com/blog/2025/12/infographics-and-ppts-with-notebooklm/</w:t>
+      </w:r>
+    </w:p>
+    <w:p>
+      <w:pPr>
+        <w:pStyle w:val="ListBullet"/>
+      </w:pPr>
+      <w:r>
+        <w:t>Alex McFarland: Create infographics with NotebookLM (now Gemini Notebook): https://alexmcfarland.substack.com/p/how-to-create-stunning-infographics</w:t>
+      </w:r>
+    </w:p>
+    <w:p>
+      <w:pPr>
+        <w:pStyle w:val="ListBullet"/>
+      </w:pPr>
+      <w:r>
+        <w:t>Paul J Lipsky: NotebookLM infographic style prompts (now Gemini Notebook): https://www.youtube.com/watch?v=2rKAAf_LRVo</w:t>
+      </w:r>
+    </w:p>
+    <w:p>
+      <w:pPr>
+        <w:pStyle w:val="ListBullet"/>
+      </w:pPr>
+      <w:r>
         <w:t>Microsoft Support: Add or remove chart titles: https://support.microsoft.com/office/add-or-remove-titles-in-a-chart-4cf3c009-1482-4908-922a-997c32ea8250</w:t>
       </w:r>
     </w:p>
@@ -6358,7 +7624,7 @@
       </w:r>
     </w:p>
     <w:sectPr>
-      <w:footerReference w:type="default" r:id="rId10"/>
+      <w:footerReference w:type="default" r:id="rId18"/>
       <w:pgSz w:w="12240" w:h="15840"/>
       <w:pgMar w:top="1440" w:right="1800" w:bottom="1440" w:left="1800" w:header="720" w:footer="720" w:gutter="0"/>
       <w:cols w:space="720"/>

</xml_diff>

<commit_message>
fix: remove learner practice portal from courseware
</commit_message>
<xml_diff>
--- a/courseware/LG-Infographics and Data Visualization with PowerPoint.docx
+++ b/courseware/LG-Infographics and Data Visualization with PowerPoint.docx
@@ -179,7 +179,7 @@
           <w:color w:val="1F6FEB"/>
           <w:sz w:val="24"/>
         </w:rPr>
-        <w:t>Version 4.0</w:t>
+        <w:t>Version 4.1</w:t>
       </w:r>
     </w:p>
     <w:p>
@@ -439,6 +439,64 @@
                 <w:sz w:val="19"/>
               </w:rPr>
               <w:t>Added the AI-first data-to-insight-to-infographic workflow, Microsoft 365 Copilot and Gemini Notebook procedures, PowerPoint conversion and comparison, prompt patterns, mock multi-source data, generated practice assets and verification controls. Migrated the package to current course code TGS-2026064178.</w:t>
+            </w:r>
+          </w:p>
+        </w:tc>
+        <w:tc>
+          <w:tcPr>
+            <w:tcW w:type="dxa" w:w="2160"/>
+          </w:tcPr>
+          <w:p>
+            <w:r/>
+            <w:r>
+              <w:rPr>
+                <w:sz w:val="19"/>
+              </w:rPr>
+              <w:t>Tertiary Infotech Academy Pte Ltd</w:t>
+            </w:r>
+          </w:p>
+        </w:tc>
+      </w:tr>
+      <w:tr>
+        <w:tc>
+          <w:tcPr>
+            <w:tcW w:type="dxa" w:w="2160"/>
+          </w:tcPr>
+          <w:p>
+            <w:r/>
+            <w:r>
+              <w:rPr>
+                <w:sz w:val="19"/>
+              </w:rPr>
+              <w:t>4.1</w:t>
+            </w:r>
+          </w:p>
+        </w:tc>
+        <w:tc>
+          <w:tcPr>
+            <w:tcW w:type="dxa" w:w="2160"/>
+          </w:tcPr>
+          <w:p>
+            <w:r/>
+            <w:r>
+              <w:rPr>
+                <w:sz w:val="19"/>
+              </w:rPr>
+              <w:t>16 August 2026</w:t>
+            </w:r>
+          </w:p>
+        </w:tc>
+        <w:tc>
+          <w:tcPr>
+            <w:tcW w:type="dxa" w:w="2160"/>
+          </w:tcPr>
+          <w:p>
+            <w:r/>
+            <w:r>
+              <w:rPr>
+                <w:sz w:val="19"/>
+              </w:rPr>
+              <w:t>Removed the obsolete learner portal slide at client direction and synchronized the Learner Guide with the revised 122-slide courseware package.</w:t>
             </w:r>
           </w:p>
         </w:tc>

</xml_diff>